<commit_message>
Update concerns module, styles, and barangay ID form templates
Made-with: Cursor
</commit_message>
<xml_diff>
--- a/brgy_forms/BRGY_ID_backup.docx
+++ b/brgy_forms/BRGY_ID_backup.docx
@@ -3,13 +3,122 @@
 <w:document xmlns:wpc="http://schemas.microsoft.com/office/word/2010/wordprocessingCanvas" xmlns:mc="http://schemas.openxmlformats.org/markup-compatibility/2006" xmlns:o="urn:schemas-microsoft-com:office:office" xmlns:r="http://schemas.openxmlformats.org/officeDocument/2006/relationships" xmlns:m="http://schemas.openxmlformats.org/officeDocument/2006/math" xmlns:v="urn:schemas-microsoft-com:vml" xmlns:wp14="http://schemas.microsoft.com/office/word/2010/wordprocessingDrawing" xmlns:wp="http://schemas.openxmlformats.org/drawingml/2006/wordprocessingDrawing" xmlns:w="http://schemas.openxmlformats.org/wordprocessingml/2006/main" xmlns:w14="http://schemas.microsoft.com/office/word/2010/wordml" xmlns:w10="urn:schemas-microsoft-com:office:word" xmlns:w15="http://schemas.microsoft.com/office/word/2012/wordml" xmlns:wpg="http://schemas.microsoft.com/office/word/2010/wordprocessingGroup" xmlns:wpi="http://schemas.microsoft.com/office/word/2010/wordprocessingInk" xmlns:wne="http://schemas.microsoft.com/office/word/2006/wordml" xmlns:wps="http://schemas.microsoft.com/office/word/2010/wordprocessingShape" xmlns:wpsCustomData="http://www.wps.cn/officeDocument/2013/wpsCustomData" mc:Ignorable="w14 w15 wp14">
   <w:body>
     <w:p>
-      <w:bookmarkStart w:id="0" w:name="_GoBack"/>
-      <w:bookmarkEnd w:id="0"/>
+      <w:r>
+        <w:drawing>
+          <wp:anchor distT="0" distB="0" distL="114300" distR="114300" simplePos="0" relativeHeight="251661312" behindDoc="0" locked="0" layoutInCell="1" allowOverlap="1">
+            <wp:simplePos x="0" y="0"/>
+            <wp:positionH relativeFrom="column">
+              <wp:posOffset>90170</wp:posOffset>
+            </wp:positionH>
+            <wp:positionV relativeFrom="paragraph">
+              <wp:posOffset>4068445</wp:posOffset>
+            </wp:positionV>
+            <wp:extent cx="1492250" cy="504190"/>
+            <wp:effectExtent l="0" t="0" r="1270" b="13970"/>
+            <wp:wrapNone/>
+            <wp:docPr id="8" name="Picture 5"/>
+            <wp:cNvGraphicFramePr>
+              <a:graphicFrameLocks xmlns:a="http://schemas.openxmlformats.org/drawingml/2006/main" noChangeAspect="1"/>
+            </wp:cNvGraphicFramePr>
+            <a:graphic xmlns:a="http://schemas.openxmlformats.org/drawingml/2006/main">
+              <a:graphicData uri="http://schemas.openxmlformats.org/drawingml/2006/picture">
+                <pic:pic xmlns:pic="http://schemas.openxmlformats.org/drawingml/2006/picture">
+                  <pic:nvPicPr>
+                    <pic:cNvPr id="8" name="Picture 5"/>
+                    <pic:cNvPicPr>
+                      <a:picLocks noChangeAspect="1"/>
+                    </pic:cNvPicPr>
+                  </pic:nvPicPr>
+                  <pic:blipFill>
+                    <a:blip r:embed="rId4" cstate="print">
+                      <a:extLst>
+                        <a:ext uri="{28A0092B-C50C-407E-A947-70E740481C1C}">
+                          <a14:useLocalDpi xmlns:a14="http://schemas.microsoft.com/office/drawing/2010/main" val="0"/>
+                        </a:ext>
+                      </a:extLst>
+                    </a:blip>
+                    <a:srcRect l="4410" t="4950" b="16146"/>
+                    <a:stretch>
+                      <a:fillRect/>
+                    </a:stretch>
+                  </pic:blipFill>
+                  <pic:spPr>
+                    <a:xfrm>
+                      <a:off x="0" y="0"/>
+                      <a:ext cx="1492250" cy="504190"/>
+                    </a:xfrm>
+                    <a:prstGeom prst="rect">
+                      <a:avLst/>
+                    </a:prstGeom>
+                  </pic:spPr>
+                </pic:pic>
+              </a:graphicData>
+            </a:graphic>
+          </wp:anchor>
+        </w:drawing>
+      </w:r>
+      <w:r>
+        <w:drawing>
+          <wp:anchor distT="0" distB="0" distL="114300" distR="114300" simplePos="0" relativeHeight="251660288" behindDoc="0" locked="0" layoutInCell="1" allowOverlap="1">
+            <wp:simplePos x="0" y="0"/>
+            <wp:positionH relativeFrom="column">
+              <wp:posOffset>37465</wp:posOffset>
+            </wp:positionH>
+            <wp:positionV relativeFrom="paragraph">
+              <wp:posOffset>3686810</wp:posOffset>
+            </wp:positionV>
+            <wp:extent cx="3267075" cy="245110"/>
+            <wp:effectExtent l="10160" t="10160" r="14605" b="19050"/>
+            <wp:wrapNone/>
+            <wp:docPr id="7" name="Picture 208"/>
+            <wp:cNvGraphicFramePr>
+              <a:graphicFrameLocks xmlns:a="http://schemas.openxmlformats.org/drawingml/2006/main" noChangeAspect="1"/>
+            </wp:cNvGraphicFramePr>
+            <a:graphic xmlns:a="http://schemas.openxmlformats.org/drawingml/2006/main">
+              <a:graphicData uri="http://schemas.openxmlformats.org/drawingml/2006/picture">
+                <pic:pic xmlns:pic="http://schemas.openxmlformats.org/drawingml/2006/picture">
+                  <pic:nvPicPr>
+                    <pic:cNvPr id="7" name="Picture 208"/>
+                    <pic:cNvPicPr>
+                      <a:picLocks noChangeAspect="1"/>
+                    </pic:cNvPicPr>
+                  </pic:nvPicPr>
+                  <pic:blipFill>
+                    <a:blip r:embed="rId5">
+                      <a:lum/>
+                    </a:blip>
+                    <a:srcRect/>
+                    <a:stretch>
+                      <a:fillRect/>
+                    </a:stretch>
+                  </pic:blipFill>
+                  <pic:spPr>
+                    <a:xfrm>
+                      <a:off x="0" y="0"/>
+                      <a:ext cx="3267075" cy="245110"/>
+                    </a:xfrm>
+                    <a:prstGeom prst="rect">
+                      <a:avLst/>
+                    </a:prstGeom>
+                    <a:noFill/>
+                    <a:ln w="10080">
+                      <a:solidFill>
+                        <a:srgbClr val="666666"/>
+                      </a:solidFill>
+                      <a:prstDash val="solid"/>
+                    </a:ln>
+                  </pic:spPr>
+                </pic:pic>
+              </a:graphicData>
+            </a:graphic>
+          </wp:anchor>
+        </w:drawing>
+      </w:r>
       <w:r>
         <mc:AlternateContent>
           <mc:Choice Requires="wps">
             <w:drawing>
-              <wp:anchor distT="0" distB="0" distL="114300" distR="114300" simplePos="0" relativeHeight="251663360" behindDoc="0" locked="0" layoutInCell="1" allowOverlap="1">
+              <wp:anchor distT="0" distB="0" distL="114300" distR="114300" simplePos="0" relativeHeight="251662336" behindDoc="0" locked="0" layoutInCell="1" allowOverlap="1">
                 <wp:simplePos x="0" y="0"/>
                 <wp:positionH relativeFrom="column">
                   <wp:posOffset>141605</wp:posOffset>
@@ -46,12 +155,21 @@
                               <w:pStyle w:val="4"/>
                               <w:kinsoku/>
                               <w:overflowPunct w:val="0"/>
-                              <w:spacing w:before="0" w:after="0" w:line="240" w:lineRule="auto"/>
-                              <w:ind w:left="0" w:right="0" w:firstLine="0"/>
+                              <w:ind w:left="0"/>
                               <w:jc w:val="left"/>
                               <w:rPr>
-                                <w:rFonts w:hint="default"/>
+                                <w:rFonts w:hint="default" w:ascii="Arial Narrow" w:hAnsi="Mangal" w:eastAsia="Microsoft YaHei"/>
+                                <w:b/>
+                                <w:color w:val="000000" w:themeColor="text1"/>
+                                <w:kern w:val="24"/>
+                                <w:sz w:val="16"/>
+                                <w:szCs w:val="16"/>
                                 <w:lang w:val="en-US"/>
+                                <w14:textFill>
+                                  <w14:solidFill>
+                                    <w14:schemeClr w14:val="tx1"/>
+                                  </w14:solidFill>
+                                </w14:textFill>
                               </w:rPr>
                             </w:pPr>
                             <w:r>
@@ -93,6 +211,7 @@
                                 <w:kern w:val="24"/>
                                 <w:sz w:val="16"/>
                                 <w:szCs w:val="16"/>
+                                <w:u w:val="single"/>
                                 <w:lang w:val="en-US"/>
                                 <w14:textFill>
                                   <w14:solidFill>
@@ -130,387 +249,7 @@
                                   </w14:solidFill>
                                 </w14:textFill>
                               </w:rPr>
-                              <w:t xml:space="preserve">                     Nationality: </w:t>
-                            </w:r>
-                            <w:r>
-                              <w:rPr>
-                                <w:rFonts w:hint="default" w:ascii="Arial Narrow" w:hAnsi="Mangal" w:eastAsia="Microsoft YaHei"/>
-                                <w:b/>
-                                <w:color w:val="000000" w:themeColor="text1"/>
-                                <w:kern w:val="24"/>
-                                <w:sz w:val="14"/>
-                                <w:szCs w:val="14"/>
-                                <w:u w:val="single"/>
-                                <w:lang w:val="en-US"/>
-                                <w14:textFill>
-                                  <w14:solidFill>
-                                    <w14:schemeClr w14:val="tx1"/>
-                                  </w14:solidFill>
-                                </w14:textFill>
-                              </w:rPr>
-                              <w:t>{{nationality}}</w:t>
-                            </w:r>
-                          </w:p>
-                          <w:p>
-                            <w:pPr>
-                              <w:pStyle w:val="4"/>
-                              <w:kinsoku/>
-                              <w:overflowPunct w:val="0"/>
-                              <w:ind w:left="0"/>
-                              <w:jc w:val="left"/>
-                              <w:rPr>
-                                <w:rFonts w:hint="default" w:ascii="Arial Narrow" w:hAnsi="Mangal" w:eastAsia="Microsoft YaHei"/>
-                                <w:b/>
-                                <w:color w:val="000000" w:themeColor="text1"/>
-                                <w:kern w:val="24"/>
-                                <w:sz w:val="16"/>
-                                <w:szCs w:val="16"/>
-                                <w:lang w:val="en-US"/>
-                                <w14:textFill>
-                                  <w14:solidFill>
-                                    <w14:schemeClr w14:val="tx1"/>
-                                  </w14:solidFill>
-                                </w14:textFill>
-                              </w:rPr>
-                            </w:pPr>
-                            <w:r>
-                              <w:rPr>
-                                <w:rFonts w:ascii="Arial Narrow" w:hAnsi="Mangal" w:eastAsia="Microsoft YaHei"/>
-                                <w:b/>
-                                <w:color w:val="000000" w:themeColor="text1"/>
-                                <w:kern w:val="24"/>
-                                <w:sz w:val="16"/>
-                                <w:szCs w:val="16"/>
-                                <w14:textFill>
-                                  <w14:solidFill>
-                                    <w14:schemeClr w14:val="tx1"/>
-                                  </w14:solidFill>
-                                </w14:textFill>
-                              </w:rPr>
-                              <w:t xml:space="preserve">Height: </w:t>
-                            </w:r>
-                            <w:r>
-                              <w:rPr>
-                                <w:rFonts w:hint="default" w:ascii="Arial Narrow" w:hAnsi="Mangal" w:eastAsia="Microsoft YaHei"/>
-                                <w:b/>
-                                <w:color w:val="000000" w:themeColor="text1"/>
-                                <w:kern w:val="24"/>
-                                <w:sz w:val="16"/>
-                                <w:szCs w:val="16"/>
-                                <w:lang w:val="en-US"/>
-                                <w14:textFill>
-                                  <w14:solidFill>
-                                    <w14:schemeClr w14:val="tx1"/>
-                                  </w14:solidFill>
-                                </w14:textFill>
-                              </w:rPr>
-                              <w:t>{{height}}</w:t>
-                            </w:r>
-                            <w:r>
-                              <w:rPr>
-                                <w:rFonts w:ascii="Arial Narrow" w:hAnsi="Mangal" w:eastAsia="Microsoft YaHei"/>
-                                <w:b/>
-                                <w:color w:val="000000" w:themeColor="text1"/>
-                                <w:kern w:val="24"/>
-                                <w:sz w:val="16"/>
-                                <w:szCs w:val="16"/>
-                                <w14:textFill>
-                                  <w14:solidFill>
-                                    <w14:schemeClr w14:val="tx1"/>
-                                  </w14:solidFill>
-                                </w14:textFill>
-                              </w:rPr>
-                              <w:t>CM</w:t>
-                            </w:r>
-                            <w:r>
-                              <w:rPr>
-                                <w:rFonts w:hint="default" w:ascii="Arial Narrow" w:hAnsi="Mangal" w:eastAsia="Microsoft YaHei"/>
-                                <w:b/>
-                                <w:color w:val="000000" w:themeColor="text1"/>
-                                <w:kern w:val="24"/>
-                                <w:sz w:val="16"/>
-                                <w:szCs w:val="16"/>
-                                <w:lang w:val="en-US"/>
-                                <w14:textFill>
-                                  <w14:solidFill>
-                                    <w14:schemeClr w14:val="tx1"/>
-                                  </w14:solidFill>
-                                </w14:textFill>
-                              </w:rPr>
-                              <w:t xml:space="preserve">    </w:t>
-                            </w:r>
-                            <w:r>
-                              <w:rPr>
-                                <w:rFonts w:hint="default" w:ascii="Arial Narrow" w:hAnsi="Mangal" w:eastAsia="Microsoft YaHei"/>
-                                <w:b/>
-                                <w:color w:val="000000" w:themeColor="text1"/>
-                                <w:kern w:val="24"/>
-                                <w:sz w:val="16"/>
-                                <w:szCs w:val="16"/>
-                                <w:lang w:val="en-US"/>
-                                <w14:textFill>
-                                  <w14:solidFill>
-                                    <w14:schemeClr w14:val="tx1"/>
-                                  </w14:solidFill>
-                                </w14:textFill>
-                              </w:rPr>
-                              <w:tab/>
-                            </w:r>
-                            <w:r>
-                              <w:rPr>
-                                <w:rFonts w:hint="default" w:ascii="Arial Narrow" w:hAnsi="Mangal" w:eastAsia="Microsoft YaHei"/>
-                                <w:b/>
-                                <w:color w:val="000000" w:themeColor="text1"/>
-                                <w:kern w:val="24"/>
-                                <w:sz w:val="16"/>
-                                <w:szCs w:val="16"/>
-                                <w:lang w:val="en-US"/>
-                                <w14:textFill>
-                                  <w14:solidFill>
-                                    <w14:schemeClr w14:val="tx1"/>
-                                  </w14:solidFill>
-                                </w14:textFill>
-                              </w:rPr>
-                              <w:tab/>
-                            </w:r>
-                            <w:r>
-                              <w:rPr>
-                                <w:rFonts w:hint="default" w:ascii="Arial Narrow" w:hAnsi="Mangal" w:eastAsia="Microsoft YaHei"/>
-                                <w:b/>
-                                <w:color w:val="000000" w:themeColor="text1"/>
-                                <w:kern w:val="24"/>
-                                <w:sz w:val="16"/>
-                                <w:szCs w:val="16"/>
-                                <w:lang w:val="en-US"/>
-                                <w14:textFill>
-                                  <w14:solidFill>
-                                    <w14:schemeClr w14:val="tx1"/>
-                                  </w14:solidFill>
-                                </w14:textFill>
-                              </w:rPr>
-                              <w:t xml:space="preserve"> </w:t>
-                            </w:r>
-                          </w:p>
-                          <w:p>
-                            <w:pPr>
-                              <w:pStyle w:val="4"/>
-                              <w:kinsoku/>
-                              <w:overflowPunct w:val="0"/>
-                              <w:ind w:left="0"/>
-                              <w:jc w:val="center"/>
-                              <w:rPr>
-                                <w:rFonts w:hint="default" w:ascii="Arial Narrow" w:hAnsi="Mangal" w:eastAsia="Microsoft YaHei"/>
-                                <w:b/>
-                                <w:color w:val="000000" w:themeColor="text1"/>
-                                <w:kern w:val="24"/>
-                                <w:sz w:val="14"/>
-                                <w:szCs w:val="14"/>
-                                <w:u w:val="single"/>
-                                <w:lang w:val="en-US"/>
-                                <w14:textFill>
-                                  <w14:solidFill>
-                                    <w14:schemeClr w14:val="tx1"/>
-                                  </w14:solidFill>
-                                </w14:textFill>
-                              </w:rPr>
-                            </w:pPr>
-                            <w:r>
-                              <w:rPr>
-                                <w:rFonts w:ascii="Arial Narrow" w:hAnsi="Mangal" w:eastAsia="Microsoft YaHei"/>
-                                <w:color w:val="000000" w:themeColor="text1"/>
-                                <w:kern w:val="24"/>
-                                <w:sz w:val="16"/>
-                                <w:szCs w:val="16"/>
-                                <w14:textFill>
-                                  <w14:solidFill>
-                                    <w14:schemeClr w14:val="tx1"/>
-                                  </w14:solidFill>
-                                </w14:textFill>
-                              </w:rPr>
-                              <w:t xml:space="preserve">Date Issued: </w:t>
-                            </w:r>
-                            <w:r>
-                              <w:rPr>
-                                <w:rFonts w:hint="default" w:ascii="Arial Narrow" w:hAnsi="Mangal" w:eastAsia="Microsoft YaHei"/>
-                                <w:b/>
-                                <w:color w:val="000000" w:themeColor="text1"/>
-                                <w:kern w:val="24"/>
-                                <w:sz w:val="14"/>
-                                <w:szCs w:val="14"/>
-                                <w:u w:val="single"/>
-                                <w:lang w:val="en-US"/>
-                                <w14:textFill>
-                                  <w14:solidFill>
-                                    <w14:schemeClr w14:val="tx1"/>
-                                  </w14:solidFill>
-                                </w14:textFill>
-                              </w:rPr>
-                              <w:t>{{date_issued}}</w:t>
-                            </w:r>
-                          </w:p>
-                          <w:p>
-                            <w:pPr>
-                              <w:pStyle w:val="4"/>
-                              <w:kinsoku/>
-                              <w:ind w:left="0"/>
-                              <w:jc w:val="center"/>
-                            </w:pPr>
-                            <w:r>
-                              <w:rPr>
-                                <w:rFonts w:hint="default" w:ascii="Arial Narrow" w:hAnsi="Mangal" w:eastAsia="Microsoft YaHei"/>
-                                <w:b/>
-                                <w:color w:val="000000" w:themeColor="text1"/>
-                                <w:kern w:val="24"/>
-                                <w:sz w:val="14"/>
-                                <w:szCs w:val="14"/>
-                                <w:lang w:val="en-US"/>
-                                <w14:textFill>
-                                  <w14:solidFill>
-                                    <w14:schemeClr w14:val="tx1"/>
-                                  </w14:solidFill>
-                                </w14:textFill>
-                              </w:rPr>
-                              <w:t>{{emergency_contact_number}}</w:t>
-                            </w:r>
-                            <w:r>
-                              <w:rPr>
-                                <w:rFonts w:hint="default" w:ascii="Arial Narrow" w:hAnsi="Mangal" w:eastAsia="Microsoft YaHei"/>
-                                <w:b/>
-                                <w:color w:val="000000" w:themeColor="text1"/>
-                                <w:kern w:val="24"/>
-                                <w:sz w:val="14"/>
-                                <w:szCs w:val="14"/>
-                                <w:lang w:val="en-US"/>
-                                <w14:textFill>
-                                  <w14:solidFill>
-                                    <w14:schemeClr w14:val="tx1"/>
-                                  </w14:solidFill>
-                                </w14:textFill>
-                              </w:rPr>
-                              <w:br w:type="textWrapping"/>
-                            </w:r>
-                            <w:r>
-                              <w:rPr>
-                                <w:rFonts w:hint="default" w:ascii="Arial Narrow" w:hAnsi="Mangal" w:eastAsia="Microsoft YaHei"/>
-                                <w:b/>
-                                <w:color w:val="000000" w:themeColor="text1"/>
-                                <w:kern w:val="24"/>
-                                <w:sz w:val="14"/>
-                                <w:szCs w:val="14"/>
-                                <w:lang w:val="en-US"/>
-                                <w14:textFill>
-                                  <w14:solidFill>
-                                    <w14:schemeClr w14:val="tx1"/>
-                                  </w14:solidFill>
-                                </w14:textFill>
-                              </w:rPr>
-                              <w:t>{{emergency_contact_name}}</w:t>
-                            </w:r>
-                            <w:r>
-                              <w:rPr>
-                                <w:rFonts w:ascii="Arial Narrow" w:hAnsi="Mangal" w:eastAsia="Microsoft YaHei"/>
-                                <w:b/>
-                                <w:color w:val="000000" w:themeColor="text1"/>
-                                <w:kern w:val="24"/>
-                                <w:sz w:val="14"/>
-                                <w:szCs w:val="14"/>
-                                <w14:textFill>
-                                  <w14:solidFill>
-                                    <w14:schemeClr w14:val="tx1"/>
-                                  </w14:solidFill>
-                                </w14:textFill>
-                              </w:rPr>
-                              <w:br w:type="textWrapping"/>
-                            </w:r>
-                            <w:r>
-                              <w:rPr>
-                                <w:rFonts w:ascii="Arial Narrow" w:hAnsi="Mangal" w:eastAsia="Microsoft YaHei"/>
-                                <w:color w:val="000000" w:themeColor="text1"/>
-                                <w:kern w:val="24"/>
-                                <w:sz w:val="14"/>
-                                <w:szCs w:val="14"/>
-                                <w14:textFill>
-                                  <w14:solidFill>
-                                    <w14:schemeClr w14:val="tx1"/>
-                                  </w14:solidFill>
-                                </w14:textFill>
-                              </w:rPr>
-                              <w:t>Person In case of --Emergency/ Contact No</w:t>
-                            </w:r>
-                            <w:r>
-                              <w:rPr>
-                                <w:rFonts w:hint="default" w:ascii="Arial Narrow" w:hAnsi="Mangal" w:eastAsia="Microsoft YaHei"/>
-                                <w:color w:val="000000" w:themeColor="text1"/>
-                                <w:kern w:val="24"/>
-                                <w:sz w:val="14"/>
-                                <w:szCs w:val="14"/>
-                                <w:lang w:val="en-US"/>
-                                <w14:textFill>
-                                  <w14:solidFill>
-                                    <w14:schemeClr w14:val="tx1"/>
-                                  </w14:solidFill>
-                                </w14:textFill>
-                              </w:rPr>
-                              <w:t>.</w:t>
-                            </w:r>
-                            <w:r>
-                              <w:rPr>
-                                <w:rFonts w:hint="default" w:ascii="Arial Narrow" w:hAnsi="Mangal" w:eastAsia="Microsoft YaHei"/>
-                                <w:color w:val="000000" w:themeColor="text1"/>
-                                <w:kern w:val="24"/>
-                                <w:sz w:val="14"/>
-                                <w:szCs w:val="14"/>
-                                <w:lang w:val="en-US"/>
-                                <w14:textFill>
-                                  <w14:solidFill>
-                                    <w14:schemeClr w14:val="tx1"/>
-                                  </w14:solidFill>
-                                </w14:textFill>
-                              </w:rPr>
-                              <w:br w:type="textWrapping"/>
-                            </w:r>
-                            <w:r>
-                              <w:rPr>
-                                <w:rFonts w:ascii="Arial Narrow" w:hAnsi="Mangal" w:eastAsia="Microsoft YaHei"/>
-                                <w:color w:val="000000" w:themeColor="text1"/>
-                                <w:kern w:val="24"/>
-                                <w:sz w:val="16"/>
-                                <w:szCs w:val="16"/>
-                                <w14:textFill>
-                                  <w14:solidFill>
-                                    <w14:schemeClr w14:val="tx1"/>
-                                  </w14:solidFill>
-                                </w14:textFill>
-                              </w:rPr>
-                              <w:t xml:space="preserve">   </w:t>
-                            </w:r>
-                          </w:p>
-                          <w:p>
-                            <w:pPr>
-                              <w:pStyle w:val="4"/>
-                              <w:kinsoku/>
-                              <w:overflowPunct w:val="0"/>
-                              <w:ind w:left="0"/>
-                              <w:jc w:val="left"/>
-                              <w:rPr>
-                                <w:rFonts w:hint="default"/>
-                                <w:lang w:val="en-US"/>
-                              </w:rPr>
-                            </w:pPr>
-                            <w:r>
-                              <w:rPr>
-                                <w:rFonts w:ascii="Arial Narrow" w:hAnsi="Mangal" w:eastAsia="Microsoft YaHei"/>
-                                <w:color w:val="000000" w:themeColor="text1"/>
-                                <w:kern w:val="24"/>
-                                <w:sz w:val="16"/>
-                                <w:szCs w:val="16"/>
-                                <w14:textFill>
-                                  <w14:solidFill>
-                                    <w14:schemeClr w14:val="tx1"/>
-                                  </w14:solidFill>
-                                </w14:textFill>
-                              </w:rPr>
-                              <w:t xml:space="preserve">Civil Status: </w:t>
+                              <w:t xml:space="preserve">                    Civil Status: </w:t>
                             </w:r>
                             <w:r>
                               <w:rPr>
@@ -537,21 +276,246 @@
                               <w:overflowPunct w:val="0"/>
                               <w:ind w:left="0"/>
                               <w:jc w:val="left"/>
+                              <w:rPr>
+                                <w:rFonts w:hint="default" w:ascii="Arial Narrow" w:hAnsi="Mangal" w:eastAsia="Microsoft YaHei"/>
+                                <w:b/>
+                                <w:color w:val="000000" w:themeColor="text1"/>
+                                <w:kern w:val="24"/>
+                                <w:sz w:val="14"/>
+                                <w:szCs w:val="14"/>
+                                <w:u w:val="single"/>
+                                <w:lang w:val="en-US"/>
+                                <w14:textFill>
+                                  <w14:solidFill>
+                                    <w14:schemeClr w14:val="tx1"/>
+                                  </w14:solidFill>
+                                </w14:textFill>
+                              </w:rPr>
                             </w:pPr>
                             <w:r>
                               <w:rPr>
-                                <w:rFonts w:ascii="Arial Narrow" w:hAnsi="Mangal" w:eastAsia="Microsoft YaHei"/>
+                                <w:rFonts w:hint="default" w:ascii="Arial Narrow" w:hAnsi="Mangal" w:eastAsia="Microsoft YaHei"/>
+                                <w:b w:val="0"/>
+                                <w:bCs/>
                                 <w:color w:val="000000" w:themeColor="text1"/>
                                 <w:kern w:val="24"/>
                                 <w:sz w:val="16"/>
                                 <w:szCs w:val="16"/>
-                                <w14:textFill>
-                                  <w14:solidFill>
-                                    <w14:schemeClr w14:val="tx1"/>
-                                  </w14:solidFill>
-                                </w14:textFill>
-                              </w:rPr>
-                              <w:t>Weight</w:t>
+                                <w:lang w:val="en-US"/>
+                                <w14:textFill>
+                                  <w14:solidFill>
+                                    <w14:schemeClr w14:val="tx1"/>
+                                  </w14:solidFill>
+                                </w14:textFill>
+                              </w:rPr>
+                              <w:t>Nationality</w:t>
+                            </w:r>
+                            <w:r>
+                              <w:rPr>
+                                <w:rFonts w:ascii="Arial Narrow" w:hAnsi="Mangal" w:eastAsia="Microsoft YaHei"/>
+                                <w:b/>
+                                <w:color w:val="000000" w:themeColor="text1"/>
+                                <w:kern w:val="24"/>
+                                <w:sz w:val="16"/>
+                                <w:szCs w:val="16"/>
+                                <w14:textFill>
+                                  <w14:solidFill>
+                                    <w14:schemeClr w14:val="tx1"/>
+                                  </w14:solidFill>
+                                </w14:textFill>
+                              </w:rPr>
+                              <w:t xml:space="preserve">: </w:t>
+                            </w:r>
+                            <w:r>
+                              <w:rPr>
+                                <w:rFonts w:hint="default" w:ascii="Arial Narrow" w:hAnsi="Mangal" w:eastAsia="Microsoft YaHei"/>
+                                <w:b/>
+                                <w:color w:val="000000" w:themeColor="text1"/>
+                                <w:kern w:val="24"/>
+                                <w:sz w:val="16"/>
+                                <w:szCs w:val="16"/>
+                                <w:u w:val="single"/>
+                                <w:lang w:val="en-US"/>
+                                <w14:textFill>
+                                  <w14:solidFill>
+                                    <w14:schemeClr w14:val="tx1"/>
+                                  </w14:solidFill>
+                                </w14:textFill>
+                              </w:rPr>
+                              <w:t>{{nationality}}</w:t>
+                            </w:r>
+                            <w:r>
+                              <w:rPr>
+                                <w:rFonts w:ascii="Arial Narrow" w:hAnsi="Mangal" w:eastAsia="Microsoft YaHei"/>
+                                <w:b/>
+                                <w:color w:val="000000" w:themeColor="text1"/>
+                                <w:kern w:val="24"/>
+                                <w:sz w:val="16"/>
+                                <w:szCs w:val="16"/>
+                                <w:u w:val="single"/>
+                                <w14:textFill>
+                                  <w14:solidFill>
+                                    <w14:schemeClr w14:val="tx1"/>
+                                  </w14:solidFill>
+                                </w14:textFill>
+                              </w:rPr>
+                              <w:t xml:space="preserve"> </w:t>
+                            </w:r>
+                            <w:r>
+                              <w:rPr>
+                                <w:rFonts w:hint="default" w:ascii="Arial Narrow" w:hAnsi="Mangal" w:eastAsia="Microsoft YaHei"/>
+                                <w:b/>
+                                <w:color w:val="000000" w:themeColor="text1"/>
+                                <w:kern w:val="24"/>
+                                <w:sz w:val="16"/>
+                                <w:szCs w:val="16"/>
+                                <w:lang w:val="en-US"/>
+                                <w14:textFill>
+                                  <w14:solidFill>
+                                    <w14:schemeClr w14:val="tx1"/>
+                                  </w14:solidFill>
+                                </w14:textFill>
+                              </w:rPr>
+                              <w:tab/>
+                            </w:r>
+                            <w:r>
+                              <w:rPr>
+                                <w:rFonts w:hint="default" w:ascii="Arial Narrow" w:hAnsi="Mangal" w:eastAsia="Microsoft YaHei"/>
+                                <w:b/>
+                                <w:color w:val="000000" w:themeColor="text1"/>
+                                <w:kern w:val="24"/>
+                                <w:sz w:val="16"/>
+                                <w:szCs w:val="16"/>
+                                <w:lang w:val="en-US"/>
+                                <w14:textFill>
+                                  <w14:solidFill>
+                                    <w14:schemeClr w14:val="tx1"/>
+                                  </w14:solidFill>
+                                </w14:textFill>
+                              </w:rPr>
+                              <w:t xml:space="preserve">                    </w:t>
+                            </w:r>
+                            <w:r>
+                              <w:rPr>
+                                <w:rFonts w:hint="default" w:ascii="Arial Narrow" w:hAnsi="Mangal" w:eastAsia="Microsoft YaHei"/>
+                                <w:b w:val="0"/>
+                                <w:bCs/>
+                                <w:color w:val="000000" w:themeColor="text1"/>
+                                <w:kern w:val="24"/>
+                                <w:sz w:val="14"/>
+                                <w:szCs w:val="14"/>
+                                <w:u w:val="none"/>
+                                <w:lang w:val="en-US"/>
+                                <w14:textFill>
+                                  <w14:solidFill>
+                                    <w14:schemeClr w14:val="tx1"/>
+                                  </w14:solidFill>
+                                </w14:textFill>
+                              </w:rPr>
+                              <w:t>W</w:t>
+                            </w:r>
+                            <w:r>
+                              <w:rPr>
+                                <w:rFonts w:ascii="Arial Narrow" w:hAnsi="Mangal" w:eastAsia="Microsoft YaHei"/>
+                                <w:b w:val="0"/>
+                                <w:bCs/>
+                                <w:color w:val="000000" w:themeColor="text1"/>
+                                <w:kern w:val="24"/>
+                                <w:sz w:val="16"/>
+                                <w:szCs w:val="16"/>
+                                <w14:textFill>
+                                  <w14:solidFill>
+                                    <w14:schemeClr w14:val="tx1"/>
+                                  </w14:solidFill>
+                                </w14:textFill>
+                              </w:rPr>
+                              <w:t>eight</w:t>
+                            </w:r>
+                            <w:r>
+                              <w:rPr>
+                                <w:rFonts w:ascii="Arial Narrow" w:hAnsi="Mangal" w:eastAsia="Microsoft YaHei"/>
+                                <w:b/>
+                                <w:color w:val="000000" w:themeColor="text1"/>
+                                <w:kern w:val="24"/>
+                                <w:sz w:val="16"/>
+                                <w:szCs w:val="16"/>
+                                <w14:textFill>
+                                  <w14:solidFill>
+                                    <w14:schemeClr w14:val="tx1"/>
+                                  </w14:solidFill>
+                                </w14:textFill>
+                              </w:rPr>
+                              <w:t xml:space="preserve">: </w:t>
+                            </w:r>
+                            <w:r>
+                              <w:rPr>
+                                <w:rFonts w:hint="default" w:ascii="Arial Narrow" w:hAnsi="Mangal" w:eastAsia="Microsoft YaHei"/>
+                                <w:b/>
+                                <w:color w:val="000000" w:themeColor="text1"/>
+                                <w:kern w:val="24"/>
+                                <w:sz w:val="16"/>
+                                <w:szCs w:val="16"/>
+                                <w:lang w:val="en-US"/>
+                                <w14:textFill>
+                                  <w14:solidFill>
+                                    <w14:schemeClr w14:val="tx1"/>
+                                  </w14:solidFill>
+                                </w14:textFill>
+                              </w:rPr>
+                              <w:t>{{weight}} KGS.</w:t>
+                            </w:r>
+                          </w:p>
+                          <w:p>
+                            <w:pPr>
+                              <w:pStyle w:val="4"/>
+                              <w:kinsoku/>
+                              <w:overflowPunct w:val="0"/>
+                              <w:jc w:val="left"/>
+                              <w:rPr>
+                                <w:rFonts w:hint="default" w:ascii="Arial Narrow" w:hAnsi="Mangal" w:eastAsia="Microsoft YaHei"/>
+                                <w:b/>
+                                <w:color w:val="000000" w:themeColor="text1"/>
+                                <w:kern w:val="24"/>
+                                <w:sz w:val="16"/>
+                                <w:szCs w:val="16"/>
+                                <w:lang w:val="en-US"/>
+                                <w14:textFill>
+                                  <w14:solidFill>
+                                    <w14:schemeClr w14:val="tx1"/>
+                                  </w14:solidFill>
+                                </w14:textFill>
+                              </w:rPr>
+                            </w:pPr>
+                            <w:r>
+                              <w:rPr>
+                                <w:rFonts w:hint="default" w:ascii="Arial Narrow" w:hAnsi="Mangal" w:eastAsia="Microsoft YaHei"/>
+                                <w:color w:val="000000" w:themeColor="text1"/>
+                                <w:kern w:val="24"/>
+                                <w:sz w:val="16"/>
+                                <w:szCs w:val="16"/>
+                                <w:lang w:val="en-US"/>
+                                <w14:textFill>
+                                  <w14:solidFill>
+                                    <w14:schemeClr w14:val="tx1"/>
+                                  </w14:solidFill>
+                                </w14:textFill>
+                              </w:rPr>
+                              <w:t>H</w:t>
+                            </w:r>
+                            <w:r>
+                              <w:rPr>
+                                <w:rFonts w:ascii="Arial Narrow" w:hAnsi="Mangal" w:eastAsia="Microsoft YaHei"/>
+                                <w:color w:val="000000" w:themeColor="text1"/>
+                                <w:kern w:val="24"/>
+                                <w:sz w:val="16"/>
+                                <w:szCs w:val="16"/>
+                                <w14:textFill>
+                                  <w14:solidFill>
+                                    <w14:schemeClr w14:val="tx1"/>
+                                  </w14:solidFill>
+                                </w14:textFill>
+                              </w:rPr>
+                              <w:t>eight</w:t>
                             </w:r>
                             <w:r>
                               <w:rPr>
@@ -584,23 +548,151 @@
                                   </w14:solidFill>
                                 </w14:textFill>
                               </w:rPr>
-                              <w:t>{{weight}}</w:t>
+                              <w:t>{{height}}</w:t>
                             </w:r>
                             <w:r>
                               <w:rPr>
+                                <w:rFonts w:hint="default" w:ascii="Arial Narrow" w:hAnsi="Mangal" w:eastAsia="Microsoft YaHei"/>
+                                <w:b/>
+                                <w:color w:val="000000" w:themeColor="text1"/>
+                                <w:kern w:val="24"/>
+                                <w:sz w:val="14"/>
+                                <w:szCs w:val="14"/>
+                                <w:u w:val="none"/>
+                                <w:lang w:val="en-US"/>
+                                <w14:textFill>
+                                  <w14:solidFill>
+                                    <w14:schemeClr w14:val="tx1"/>
+                                  </w14:solidFill>
+                                </w14:textFill>
+                              </w:rPr>
+                              <w:t xml:space="preserve">                                            </w:t>
+                            </w:r>
+                            <w:r>
+                              <w:rPr>
+                                <w:rFonts w:hint="default" w:ascii="Arial Narrow" w:hAnsi="Mangal" w:eastAsia="Microsoft YaHei"/>
+                                <w:b w:val="0"/>
+                                <w:bCs/>
+                                <w:color w:val="000000" w:themeColor="text1"/>
+                                <w:kern w:val="24"/>
+                                <w:sz w:val="14"/>
+                                <w:szCs w:val="14"/>
+                                <w:u w:val="single"/>
+                                <w:lang w:val="en-US"/>
+                                <w14:textFill>
+                                  <w14:solidFill>
+                                    <w14:schemeClr w14:val="tx1"/>
+                                  </w14:solidFill>
+                                </w14:textFill>
+                              </w:rPr>
+                              <w:t>Exp. Date</w:t>
+                            </w:r>
+                            <w:r>
+                              <w:rPr>
                                 <w:rFonts w:ascii="Arial Narrow" w:hAnsi="Mangal" w:eastAsia="Microsoft YaHei"/>
-                                <w:b/>
+                                <w:b w:val="0"/>
+                                <w:bCs/>
                                 <w:color w:val="000000" w:themeColor="text1"/>
                                 <w:kern w:val="24"/>
                                 <w:sz w:val="16"/>
                                 <w:szCs w:val="16"/>
-                                <w14:textFill>
-                                  <w14:solidFill>
-                                    <w14:schemeClr w14:val="tx1"/>
-                                  </w14:solidFill>
-                                </w14:textFill>
-                              </w:rPr>
-                              <w:t xml:space="preserve"> KLS.</w:t>
+                                <w:u w:val="single"/>
+                                <w14:textFill>
+                                  <w14:solidFill>
+                                    <w14:schemeClr w14:val="tx1"/>
+                                  </w14:solidFill>
+                                </w14:textFill>
+                              </w:rPr>
+                              <w:t xml:space="preserve">: </w:t>
+                            </w:r>
+                            <w:r>
+                              <w:rPr>
+                                <w:rFonts w:hint="default" w:ascii="Arial Narrow" w:hAnsi="Mangal" w:eastAsia="Microsoft YaHei"/>
+                                <w:b/>
+                                <w:bCs w:val="0"/>
+                                <w:color w:val="000000" w:themeColor="text1"/>
+                                <w:kern w:val="24"/>
+                                <w:sz w:val="16"/>
+                                <w:szCs w:val="16"/>
+                                <w:u w:val="single"/>
+                                <w:lang w:val="en-US"/>
+                                <w14:textFill>
+                                  <w14:solidFill>
+                                    <w14:schemeClr w14:val="tx1"/>
+                                  </w14:solidFill>
+                                </w14:textFill>
+                              </w:rPr>
+                              <w:t>{{expiration}}</w:t>
+                            </w:r>
+                            <w:r>
+                              <w:rPr>
+                                <w:rFonts w:hint="default" w:ascii="Arial Narrow" w:hAnsi="Mangal" w:eastAsia="Microsoft YaHei"/>
+                                <w:b w:val="0"/>
+                                <w:bCs/>
+                                <w:color w:val="000000" w:themeColor="text1"/>
+                                <w:kern w:val="24"/>
+                                <w:sz w:val="16"/>
+                                <w:szCs w:val="16"/>
+                                <w:u w:val="single"/>
+                                <w:lang w:val="en-US"/>
+                                <w14:textFill>
+                                  <w14:solidFill>
+                                    <w14:schemeClr w14:val="tx1"/>
+                                  </w14:solidFill>
+                                </w14:textFill>
+                              </w:rPr>
+                              <w:t xml:space="preserve"> </w:t>
+                            </w:r>
+                            <w:r>
+                              <w:rPr>
+                                <w:rFonts w:hint="default" w:ascii="Arial Narrow" w:hAnsi="Mangal" w:eastAsia="Microsoft YaHei"/>
+                                <w:b/>
+                                <w:color w:val="000000" w:themeColor="text1"/>
+                                <w:kern w:val="24"/>
+                                <w:sz w:val="16"/>
+                                <w:szCs w:val="16"/>
+                                <w:lang w:val="en-US"/>
+                                <w14:textFill>
+                                  <w14:solidFill>
+                                    <w14:schemeClr w14:val="tx1"/>
+                                  </w14:solidFill>
+                                </w14:textFill>
+                              </w:rPr>
+                              <w:t xml:space="preserve">  </w:t>
+                            </w:r>
+                            <w:r>
+                              <w:rPr>
+                                <w:rFonts w:hint="default" w:ascii="Arial Narrow" w:hAnsi="Mangal" w:eastAsia="Microsoft YaHei"/>
+                                <w:b/>
+                                <w:color w:val="000000" w:themeColor="text1"/>
+                                <w:kern w:val="24"/>
+                                <w:sz w:val="16"/>
+                                <w:szCs w:val="16"/>
+                                <w:lang w:val="en-US"/>
+                                <w14:textFill>
+                                  <w14:solidFill>
+                                    <w14:schemeClr w14:val="tx1"/>
+                                  </w14:solidFill>
+                                </w14:textFill>
+                              </w:rPr>
+                              <w:tab/>
+                            </w:r>
+                            <w:r>
+                              <w:rPr>
+                                <w:rFonts w:hint="default" w:ascii="Arial Narrow" w:hAnsi="Mangal" w:eastAsia="Microsoft YaHei"/>
+                                <w:b/>
+                                <w:color w:val="000000" w:themeColor="text1"/>
+                                <w:kern w:val="24"/>
+                                <w:sz w:val="16"/>
+                                <w:szCs w:val="16"/>
+                                <w:lang w:val="en-US"/>
+                                <w14:textFill>
+                                  <w14:solidFill>
+                                    <w14:schemeClr w14:val="tx1"/>
+                                  </w14:solidFill>
+                                </w14:textFill>
+                              </w:rPr>
+                              <w:t xml:space="preserve"> </w:t>
                             </w:r>
                           </w:p>
                           <w:p>
@@ -609,45 +701,7 @@
                               <w:kinsoku/>
                               <w:overflowPunct w:val="0"/>
                               <w:ind w:left="0"/>
-                              <w:jc w:val="left"/>
-                              <w:rPr>
-                                <w:rFonts w:hint="default"/>
-                                <w:lang w:val="en-US"/>
-                              </w:rPr>
-                            </w:pPr>
-                            <w:r>
-                              <w:rPr>
-                                <w:rFonts w:ascii="Arial Narrow" w:hAnsi="Mangal" w:eastAsia="Microsoft YaHei"/>
-                                <w:color w:val="000000" w:themeColor="text1"/>
-                                <w:kern w:val="24"/>
-                                <w:sz w:val="14"/>
-                                <w:szCs w:val="14"/>
-                                <w14:textFill>
-                                  <w14:solidFill>
-                                    <w14:schemeClr w14:val="tx1"/>
-                                  </w14:solidFill>
-                                </w14:textFill>
-                              </w:rPr>
-                              <w:t xml:space="preserve">Exp. Date: </w:t>
-                            </w:r>
-                            <w:r>
-                              <w:rPr>
-                                <w:rFonts w:ascii="Arial Narrow" w:hAnsi="Mangal" w:eastAsia="Microsoft YaHei"/>
-                                <w:b/>
-                                <w:color w:val="000000" w:themeColor="text1"/>
-                                <w:kern w:val="24"/>
-                                <w:sz w:val="14"/>
-                                <w:szCs w:val="14"/>
-                                <w:u w:val="single"/>
-                                <w14:textFill>
-                                  <w14:solidFill>
-                                    <w14:schemeClr w14:val="tx1"/>
-                                  </w14:solidFill>
-                                </w14:textFill>
-                              </w:rPr>
-                              <w:t xml:space="preserve"> </w:t>
-                            </w:r>
-                            <w:r>
+                              <w:jc w:val="both"/>
                               <w:rPr>
                                 <w:rFonts w:hint="default" w:ascii="Arial Narrow" w:hAnsi="Mangal" w:eastAsia="Microsoft YaHei"/>
                                 <w:b/>
@@ -663,7 +717,225 @@
                                   </w14:solidFill>
                                 </w14:textFill>
                               </w:rPr>
-                              <w:t>{{expiration}}</w:t>
+                            </w:pPr>
+                            <w:r>
+                              <w:rPr>
+                                <w:rFonts w:ascii="Arial Narrow" w:hAnsi="Mangal" w:eastAsia="Microsoft YaHei"/>
+                                <w:color w:val="000000" w:themeColor="text1"/>
+                                <w:kern w:val="24"/>
+                                <w:sz w:val="16"/>
+                                <w:szCs w:val="16"/>
+                                <w14:textFill>
+                                  <w14:solidFill>
+                                    <w14:schemeClr w14:val="tx1"/>
+                                  </w14:solidFill>
+                                </w14:textFill>
+                              </w:rPr>
+                              <w:t xml:space="preserve">Date Issued: </w:t>
+                            </w:r>
+                            <w:r>
+                              <w:rPr>
+                                <w:rFonts w:hint="default" w:ascii="Arial Narrow" w:hAnsi="Mangal" w:eastAsia="Microsoft YaHei"/>
+                                <w:b/>
+                                <w:color w:val="000000" w:themeColor="text1"/>
+                                <w:kern w:val="24"/>
+                                <w:sz w:val="14"/>
+                                <w:szCs w:val="14"/>
+                                <w:u w:val="single"/>
+                                <w:lang w:val="en-US"/>
+                                <w14:textFill>
+                                  <w14:solidFill>
+                                    <w14:schemeClr w14:val="tx1"/>
+                                  </w14:solidFill>
+                                </w14:textFill>
+                              </w:rPr>
+                              <w:t>{{date_issued}}</w:t>
+                            </w:r>
+                          </w:p>
+                          <w:p>
+                            <w:pPr>
+                              <w:pStyle w:val="4"/>
+                              <w:kinsoku/>
+                              <w:ind w:left="0"/>
+                              <w:jc w:val="center"/>
+                              <w:rPr>
+                                <w:rFonts w:hint="default" w:ascii="Arial Narrow" w:hAnsi="Mangal" w:eastAsia="Microsoft YaHei"/>
+                                <w:b/>
+                                <w:color w:val="000000" w:themeColor="text1"/>
+                                <w:kern w:val="24"/>
+                                <w:sz w:val="14"/>
+                                <w:szCs w:val="14"/>
+                                <w:lang w:val="en-US"/>
+                                <w14:textFill>
+                                  <w14:solidFill>
+                                    <w14:schemeClr w14:val="tx1"/>
+                                  </w14:solidFill>
+                                </w14:textFill>
+                              </w:rPr>
+                            </w:pPr>
+                          </w:p>
+                          <w:p>
+                            <w:pPr>
+                              <w:pStyle w:val="4"/>
+                              <w:kinsoku/>
+                              <w:ind w:left="0"/>
+                              <w:jc w:val="both"/>
+                              <w:rPr>
+                                <w:rFonts w:hint="default" w:ascii="Arial Narrow" w:hAnsi="Mangal" w:eastAsia="Microsoft YaHei"/>
+                                <w:b/>
+                                <w:color w:val="000000" w:themeColor="text1"/>
+                                <w:kern w:val="24"/>
+                                <w:sz w:val="14"/>
+                                <w:szCs w:val="14"/>
+                                <w:lang w:val="en-US"/>
+                                <w14:textFill>
+                                  <w14:solidFill>
+                                    <w14:schemeClr w14:val="tx1"/>
+                                  </w14:solidFill>
+                                </w14:textFill>
+                              </w:rPr>
+                            </w:pPr>
+                          </w:p>
+                          <w:p>
+                            <w:pPr>
+                              <w:pStyle w:val="4"/>
+                              <w:kinsoku/>
+                              <w:ind w:left="0"/>
+                              <w:jc w:val="center"/>
+                              <w:rPr>
+                                <w:rFonts w:hint="default" w:ascii="Arial Narrow" w:hAnsi="Mangal" w:eastAsia="Microsoft YaHei"/>
+                                <w:b/>
+                                <w:color w:val="000000" w:themeColor="text1"/>
+                                <w:kern w:val="24"/>
+                                <w:sz w:val="14"/>
+                                <w:szCs w:val="14"/>
+                                <w:lang w:val="en-US"/>
+                                <w14:textFill>
+                                  <w14:solidFill>
+                                    <w14:schemeClr w14:val="tx1"/>
+                                  </w14:solidFill>
+                                </w14:textFill>
+                              </w:rPr>
+                            </w:pPr>
+                          </w:p>
+                          <w:p>
+                            <w:pPr>
+                              <w:pStyle w:val="4"/>
+                              <w:kinsoku/>
+                              <w:ind w:left="0"/>
+                              <w:jc w:val="center"/>
+                            </w:pPr>
+                            <w:r>
+                              <w:rPr>
+                                <w:rFonts w:hint="default" w:ascii="Arial Narrow" w:hAnsi="Mangal" w:eastAsia="Microsoft YaHei"/>
+                                <w:b/>
+                                <w:color w:val="000000" w:themeColor="text1"/>
+                                <w:kern w:val="24"/>
+                                <w:sz w:val="14"/>
+                                <w:szCs w:val="14"/>
+                                <w:lang w:val="en-US"/>
+                                <w14:textFill>
+                                  <w14:solidFill>
+                                    <w14:schemeClr w14:val="tx1"/>
+                                  </w14:solidFill>
+                                </w14:textFill>
+                              </w:rPr>
+                              <w:br w:type="textWrapping"/>
+                            </w:r>
+                            <w:r>
+                              <w:rPr>
+                                <w:rFonts w:hint="default" w:ascii="Arial Narrow" w:hAnsi="Mangal" w:eastAsia="Microsoft YaHei"/>
+                                <w:b/>
+                                <w:color w:val="000000" w:themeColor="text1"/>
+                                <w:kern w:val="24"/>
+                                <w:sz w:val="14"/>
+                                <w:szCs w:val="14"/>
+                                <w:lang w:val="en-US"/>
+                                <w14:textFill>
+                                  <w14:solidFill>
+                                    <w14:schemeClr w14:val="tx1"/>
+                                  </w14:solidFill>
+                                </w14:textFill>
+                              </w:rPr>
+                              <w:t>{{emergency_contact_name}} / {{emergency_contact_number}}</w:t>
+                            </w:r>
+                            <w:r>
+                              <w:rPr>
+                                <w:rFonts w:ascii="Arial Narrow" w:hAnsi="Mangal" w:eastAsia="Microsoft YaHei"/>
+                                <w:b/>
+                                <w:color w:val="000000" w:themeColor="text1"/>
+                                <w:kern w:val="24"/>
+                                <w:sz w:val="14"/>
+                                <w:szCs w:val="14"/>
+                                <w14:textFill>
+                                  <w14:solidFill>
+                                    <w14:schemeClr w14:val="tx1"/>
+                                  </w14:solidFill>
+                                </w14:textFill>
+                              </w:rPr>
+                              <w:br w:type="textWrapping"/>
+                            </w:r>
+                            <w:r>
+                              <w:rPr>
+                                <w:rFonts w:ascii="Arial Narrow" w:hAnsi="Mangal" w:eastAsia="Microsoft YaHei"/>
+                                <w:color w:val="000000" w:themeColor="text1"/>
+                                <w:kern w:val="24"/>
+                                <w:sz w:val="14"/>
+                                <w:szCs w:val="14"/>
+                                <w14:textFill>
+                                  <w14:solidFill>
+                                    <w14:schemeClr w14:val="tx1"/>
+                                  </w14:solidFill>
+                                </w14:textFill>
+                              </w:rPr>
+                              <w:t>Person In case of Emergency/ Contact No</w:t>
+                            </w:r>
+                            <w:r>
+                              <w:rPr>
+                                <w:rFonts w:hint="default" w:ascii="Arial Narrow" w:hAnsi="Mangal" w:eastAsia="Microsoft YaHei"/>
+                                <w:color w:val="000000" w:themeColor="text1"/>
+                                <w:kern w:val="24"/>
+                                <w:sz w:val="14"/>
+                                <w:szCs w:val="14"/>
+                                <w:lang w:val="en-US"/>
+                                <w14:textFill>
+                                  <w14:solidFill>
+                                    <w14:schemeClr w14:val="tx1"/>
+                                  </w14:solidFill>
+                                </w14:textFill>
+                              </w:rPr>
+                              <w:t>:</w:t>
+                            </w:r>
+                            <w:r>
+                              <w:rPr>
+                                <w:rFonts w:hint="default" w:ascii="Arial Narrow" w:hAnsi="Mangal" w:eastAsia="Microsoft YaHei"/>
+                                <w:color w:val="000000" w:themeColor="text1"/>
+                                <w:kern w:val="24"/>
+                                <w:sz w:val="14"/>
+                                <w:szCs w:val="14"/>
+                                <w:lang w:val="en-US"/>
+                                <w14:textFill>
+                                  <w14:solidFill>
+                                    <w14:schemeClr w14:val="tx1"/>
+                                  </w14:solidFill>
+                                </w14:textFill>
+                              </w:rPr>
+                              <w:br w:type="textWrapping"/>
+                            </w:r>
+                            <w:r>
+                              <w:rPr>
+                                <w:rFonts w:ascii="Arial Narrow" w:hAnsi="Mangal" w:eastAsia="Microsoft YaHei"/>
+                                <w:color w:val="000000" w:themeColor="text1"/>
+                                <w:kern w:val="24"/>
+                                <w:sz w:val="16"/>
+                                <w:szCs w:val="16"/>
+                                <w14:textFill>
+                                  <w14:solidFill>
+                                    <w14:schemeClr w14:val="tx1"/>
+                                  </w14:solidFill>
+                                </w14:textFill>
+                              </w:rPr>
+                              <w:t xml:space="preserve">   </w:t>
                             </w:r>
                           </w:p>
                           <w:p>
@@ -689,7 +961,7 @@
           </mc:Choice>
           <mc:Fallback>
             <w:pict>
-              <v:shape id="TextBox 215" o:spid="_x0000_s1026" o:spt="202" type="#_x0000_t202" style="position:absolute;left:0pt;margin-left:11.15pt;margin-top:199.65pt;height:93pt;width:242.55pt;z-index:251663360;mso-width-relative:page;mso-height-relative:page;" filled="f" stroked="f" coordsize="21600,21600" o:gfxdata="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">
+              <v:shape id="TextBox 215" o:spid="_x0000_s1026" o:spt="202" type="#_x0000_t202" style="position:absolute;left:0pt;margin-left:11.15pt;margin-top:199.65pt;height:93pt;width:242.55pt;z-index:251662336;mso-width-relative:page;mso-height-relative:page;" filled="f" stroked="f" coordsize="21600,21600" o:gfxdata="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">
                 <v:fill on="f" focussize="0,0"/>
                 <v:stroke on="f"/>
                 <v:imagedata o:title=""/>
@@ -701,12 +973,21 @@
                         <w:pStyle w:val="4"/>
                         <w:kinsoku/>
                         <w:overflowPunct w:val="0"/>
-                        <w:spacing w:before="0" w:after="0" w:line="240" w:lineRule="auto"/>
-                        <w:ind w:left="0" w:right="0" w:firstLine="0"/>
+                        <w:ind w:left="0"/>
                         <w:jc w:val="left"/>
                         <w:rPr>
-                          <w:rFonts w:hint="default"/>
+                          <w:rFonts w:hint="default" w:ascii="Arial Narrow" w:hAnsi="Mangal" w:eastAsia="Microsoft YaHei"/>
+                          <w:b/>
+                          <w:color w:val="000000" w:themeColor="text1"/>
+                          <w:kern w:val="24"/>
+                          <w:sz w:val="16"/>
+                          <w:szCs w:val="16"/>
                           <w:lang w:val="en-US"/>
+                          <w14:textFill>
+                            <w14:solidFill>
+                              <w14:schemeClr w14:val="tx1"/>
+                            </w14:solidFill>
+                          </w14:textFill>
                         </w:rPr>
                       </w:pPr>
                       <w:r>
@@ -748,6 +1029,7 @@
                           <w:kern w:val="24"/>
                           <w:sz w:val="16"/>
                           <w:szCs w:val="16"/>
+                          <w:u w:val="single"/>
                           <w:lang w:val="en-US"/>
                           <w14:textFill>
                             <w14:solidFill>
@@ -785,387 +1067,7 @@
                             </w14:solidFill>
                           </w14:textFill>
                         </w:rPr>
-                        <w:t xml:space="preserve">                     Nationality: </w:t>
-                      </w:r>
-                      <w:r>
-                        <w:rPr>
-                          <w:rFonts w:hint="default" w:ascii="Arial Narrow" w:hAnsi="Mangal" w:eastAsia="Microsoft YaHei"/>
-                          <w:b/>
-                          <w:color w:val="000000" w:themeColor="text1"/>
-                          <w:kern w:val="24"/>
-                          <w:sz w:val="14"/>
-                          <w:szCs w:val="14"/>
-                          <w:u w:val="single"/>
-                          <w:lang w:val="en-US"/>
-                          <w14:textFill>
-                            <w14:solidFill>
-                              <w14:schemeClr w14:val="tx1"/>
-                            </w14:solidFill>
-                          </w14:textFill>
-                        </w:rPr>
-                        <w:t>{{nationality}}</w:t>
-                      </w:r>
-                    </w:p>
-                    <w:p>
-                      <w:pPr>
-                        <w:pStyle w:val="4"/>
-                        <w:kinsoku/>
-                        <w:overflowPunct w:val="0"/>
-                        <w:ind w:left="0"/>
-                        <w:jc w:val="left"/>
-                        <w:rPr>
-                          <w:rFonts w:hint="default" w:ascii="Arial Narrow" w:hAnsi="Mangal" w:eastAsia="Microsoft YaHei"/>
-                          <w:b/>
-                          <w:color w:val="000000" w:themeColor="text1"/>
-                          <w:kern w:val="24"/>
-                          <w:sz w:val="16"/>
-                          <w:szCs w:val="16"/>
-                          <w:lang w:val="en-US"/>
-                          <w14:textFill>
-                            <w14:solidFill>
-                              <w14:schemeClr w14:val="tx1"/>
-                            </w14:solidFill>
-                          </w14:textFill>
-                        </w:rPr>
-                      </w:pPr>
-                      <w:r>
-                        <w:rPr>
-                          <w:rFonts w:ascii="Arial Narrow" w:hAnsi="Mangal" w:eastAsia="Microsoft YaHei"/>
-                          <w:b/>
-                          <w:color w:val="000000" w:themeColor="text1"/>
-                          <w:kern w:val="24"/>
-                          <w:sz w:val="16"/>
-                          <w:szCs w:val="16"/>
-                          <w14:textFill>
-                            <w14:solidFill>
-                              <w14:schemeClr w14:val="tx1"/>
-                            </w14:solidFill>
-                          </w14:textFill>
-                        </w:rPr>
-                        <w:t xml:space="preserve">Height: </w:t>
-                      </w:r>
-                      <w:r>
-                        <w:rPr>
-                          <w:rFonts w:hint="default" w:ascii="Arial Narrow" w:hAnsi="Mangal" w:eastAsia="Microsoft YaHei"/>
-                          <w:b/>
-                          <w:color w:val="000000" w:themeColor="text1"/>
-                          <w:kern w:val="24"/>
-                          <w:sz w:val="16"/>
-                          <w:szCs w:val="16"/>
-                          <w:lang w:val="en-US"/>
-                          <w14:textFill>
-                            <w14:solidFill>
-                              <w14:schemeClr w14:val="tx1"/>
-                            </w14:solidFill>
-                          </w14:textFill>
-                        </w:rPr>
-                        <w:t>{{height}}</w:t>
-                      </w:r>
-                      <w:r>
-                        <w:rPr>
-                          <w:rFonts w:ascii="Arial Narrow" w:hAnsi="Mangal" w:eastAsia="Microsoft YaHei"/>
-                          <w:b/>
-                          <w:color w:val="000000" w:themeColor="text1"/>
-                          <w:kern w:val="24"/>
-                          <w:sz w:val="16"/>
-                          <w:szCs w:val="16"/>
-                          <w14:textFill>
-                            <w14:solidFill>
-                              <w14:schemeClr w14:val="tx1"/>
-                            </w14:solidFill>
-                          </w14:textFill>
-                        </w:rPr>
-                        <w:t>CM</w:t>
-                      </w:r>
-                      <w:r>
-                        <w:rPr>
-                          <w:rFonts w:hint="default" w:ascii="Arial Narrow" w:hAnsi="Mangal" w:eastAsia="Microsoft YaHei"/>
-                          <w:b/>
-                          <w:color w:val="000000" w:themeColor="text1"/>
-                          <w:kern w:val="24"/>
-                          <w:sz w:val="16"/>
-                          <w:szCs w:val="16"/>
-                          <w:lang w:val="en-US"/>
-                          <w14:textFill>
-                            <w14:solidFill>
-                              <w14:schemeClr w14:val="tx1"/>
-                            </w14:solidFill>
-                          </w14:textFill>
-                        </w:rPr>
-                        <w:t xml:space="preserve">    </w:t>
-                      </w:r>
-                      <w:r>
-                        <w:rPr>
-                          <w:rFonts w:hint="default" w:ascii="Arial Narrow" w:hAnsi="Mangal" w:eastAsia="Microsoft YaHei"/>
-                          <w:b/>
-                          <w:color w:val="000000" w:themeColor="text1"/>
-                          <w:kern w:val="24"/>
-                          <w:sz w:val="16"/>
-                          <w:szCs w:val="16"/>
-                          <w:lang w:val="en-US"/>
-                          <w14:textFill>
-                            <w14:solidFill>
-                              <w14:schemeClr w14:val="tx1"/>
-                            </w14:solidFill>
-                          </w14:textFill>
-                        </w:rPr>
-                        <w:tab/>
-                      </w:r>
-                      <w:r>
-                        <w:rPr>
-                          <w:rFonts w:hint="default" w:ascii="Arial Narrow" w:hAnsi="Mangal" w:eastAsia="Microsoft YaHei"/>
-                          <w:b/>
-                          <w:color w:val="000000" w:themeColor="text1"/>
-                          <w:kern w:val="24"/>
-                          <w:sz w:val="16"/>
-                          <w:szCs w:val="16"/>
-                          <w:lang w:val="en-US"/>
-                          <w14:textFill>
-                            <w14:solidFill>
-                              <w14:schemeClr w14:val="tx1"/>
-                            </w14:solidFill>
-                          </w14:textFill>
-                        </w:rPr>
-                        <w:tab/>
-                      </w:r>
-                      <w:r>
-                        <w:rPr>
-                          <w:rFonts w:hint="default" w:ascii="Arial Narrow" w:hAnsi="Mangal" w:eastAsia="Microsoft YaHei"/>
-                          <w:b/>
-                          <w:color w:val="000000" w:themeColor="text1"/>
-                          <w:kern w:val="24"/>
-                          <w:sz w:val="16"/>
-                          <w:szCs w:val="16"/>
-                          <w:lang w:val="en-US"/>
-                          <w14:textFill>
-                            <w14:solidFill>
-                              <w14:schemeClr w14:val="tx1"/>
-                            </w14:solidFill>
-                          </w14:textFill>
-                        </w:rPr>
-                        <w:t xml:space="preserve"> </w:t>
-                      </w:r>
-                    </w:p>
-                    <w:p>
-                      <w:pPr>
-                        <w:pStyle w:val="4"/>
-                        <w:kinsoku/>
-                        <w:overflowPunct w:val="0"/>
-                        <w:ind w:left="0"/>
-                        <w:jc w:val="center"/>
-                        <w:rPr>
-                          <w:rFonts w:hint="default" w:ascii="Arial Narrow" w:hAnsi="Mangal" w:eastAsia="Microsoft YaHei"/>
-                          <w:b/>
-                          <w:color w:val="000000" w:themeColor="text1"/>
-                          <w:kern w:val="24"/>
-                          <w:sz w:val="14"/>
-                          <w:szCs w:val="14"/>
-                          <w:u w:val="single"/>
-                          <w:lang w:val="en-US"/>
-                          <w14:textFill>
-                            <w14:solidFill>
-                              <w14:schemeClr w14:val="tx1"/>
-                            </w14:solidFill>
-                          </w14:textFill>
-                        </w:rPr>
-                      </w:pPr>
-                      <w:r>
-                        <w:rPr>
-                          <w:rFonts w:ascii="Arial Narrow" w:hAnsi="Mangal" w:eastAsia="Microsoft YaHei"/>
-                          <w:color w:val="000000" w:themeColor="text1"/>
-                          <w:kern w:val="24"/>
-                          <w:sz w:val="16"/>
-                          <w:szCs w:val="16"/>
-                          <w14:textFill>
-                            <w14:solidFill>
-                              <w14:schemeClr w14:val="tx1"/>
-                            </w14:solidFill>
-                          </w14:textFill>
-                        </w:rPr>
-                        <w:t xml:space="preserve">Date Issued: </w:t>
-                      </w:r>
-                      <w:r>
-                        <w:rPr>
-                          <w:rFonts w:hint="default" w:ascii="Arial Narrow" w:hAnsi="Mangal" w:eastAsia="Microsoft YaHei"/>
-                          <w:b/>
-                          <w:color w:val="000000" w:themeColor="text1"/>
-                          <w:kern w:val="24"/>
-                          <w:sz w:val="14"/>
-                          <w:szCs w:val="14"/>
-                          <w:u w:val="single"/>
-                          <w:lang w:val="en-US"/>
-                          <w14:textFill>
-                            <w14:solidFill>
-                              <w14:schemeClr w14:val="tx1"/>
-                            </w14:solidFill>
-                          </w14:textFill>
-                        </w:rPr>
-                        <w:t>{{date_issued}}</w:t>
-                      </w:r>
-                    </w:p>
-                    <w:p>
-                      <w:pPr>
-                        <w:pStyle w:val="4"/>
-                        <w:kinsoku/>
-                        <w:ind w:left="0"/>
-                        <w:jc w:val="center"/>
-                      </w:pPr>
-                      <w:r>
-                        <w:rPr>
-                          <w:rFonts w:hint="default" w:ascii="Arial Narrow" w:hAnsi="Mangal" w:eastAsia="Microsoft YaHei"/>
-                          <w:b/>
-                          <w:color w:val="000000" w:themeColor="text1"/>
-                          <w:kern w:val="24"/>
-                          <w:sz w:val="14"/>
-                          <w:szCs w:val="14"/>
-                          <w:lang w:val="en-US"/>
-                          <w14:textFill>
-                            <w14:solidFill>
-                              <w14:schemeClr w14:val="tx1"/>
-                            </w14:solidFill>
-                          </w14:textFill>
-                        </w:rPr>
-                        <w:t>{{emergency_contact_number}}</w:t>
-                      </w:r>
-                      <w:r>
-                        <w:rPr>
-                          <w:rFonts w:hint="default" w:ascii="Arial Narrow" w:hAnsi="Mangal" w:eastAsia="Microsoft YaHei"/>
-                          <w:b/>
-                          <w:color w:val="000000" w:themeColor="text1"/>
-                          <w:kern w:val="24"/>
-                          <w:sz w:val="14"/>
-                          <w:szCs w:val="14"/>
-                          <w:lang w:val="en-US"/>
-                          <w14:textFill>
-                            <w14:solidFill>
-                              <w14:schemeClr w14:val="tx1"/>
-                            </w14:solidFill>
-                          </w14:textFill>
-                        </w:rPr>
-                        <w:br w:type="textWrapping"/>
-                      </w:r>
-                      <w:r>
-                        <w:rPr>
-                          <w:rFonts w:hint="default" w:ascii="Arial Narrow" w:hAnsi="Mangal" w:eastAsia="Microsoft YaHei"/>
-                          <w:b/>
-                          <w:color w:val="000000" w:themeColor="text1"/>
-                          <w:kern w:val="24"/>
-                          <w:sz w:val="14"/>
-                          <w:szCs w:val="14"/>
-                          <w:lang w:val="en-US"/>
-                          <w14:textFill>
-                            <w14:solidFill>
-                              <w14:schemeClr w14:val="tx1"/>
-                            </w14:solidFill>
-                          </w14:textFill>
-                        </w:rPr>
-                        <w:t>{{emergency_contact_name}}</w:t>
-                      </w:r>
-                      <w:r>
-                        <w:rPr>
-                          <w:rFonts w:ascii="Arial Narrow" w:hAnsi="Mangal" w:eastAsia="Microsoft YaHei"/>
-                          <w:b/>
-                          <w:color w:val="000000" w:themeColor="text1"/>
-                          <w:kern w:val="24"/>
-                          <w:sz w:val="14"/>
-                          <w:szCs w:val="14"/>
-                          <w14:textFill>
-                            <w14:solidFill>
-                              <w14:schemeClr w14:val="tx1"/>
-                            </w14:solidFill>
-                          </w14:textFill>
-                        </w:rPr>
-                        <w:br w:type="textWrapping"/>
-                      </w:r>
-                      <w:r>
-                        <w:rPr>
-                          <w:rFonts w:ascii="Arial Narrow" w:hAnsi="Mangal" w:eastAsia="Microsoft YaHei"/>
-                          <w:color w:val="000000" w:themeColor="text1"/>
-                          <w:kern w:val="24"/>
-                          <w:sz w:val="14"/>
-                          <w:szCs w:val="14"/>
-                          <w14:textFill>
-                            <w14:solidFill>
-                              <w14:schemeClr w14:val="tx1"/>
-                            </w14:solidFill>
-                          </w14:textFill>
-                        </w:rPr>
-                        <w:t>Person In case of --Emergency/ Contact No</w:t>
-                      </w:r>
-                      <w:r>
-                        <w:rPr>
-                          <w:rFonts w:hint="default" w:ascii="Arial Narrow" w:hAnsi="Mangal" w:eastAsia="Microsoft YaHei"/>
-                          <w:color w:val="000000" w:themeColor="text1"/>
-                          <w:kern w:val="24"/>
-                          <w:sz w:val="14"/>
-                          <w:szCs w:val="14"/>
-                          <w:lang w:val="en-US"/>
-                          <w14:textFill>
-                            <w14:solidFill>
-                              <w14:schemeClr w14:val="tx1"/>
-                            </w14:solidFill>
-                          </w14:textFill>
-                        </w:rPr>
-                        <w:t>.</w:t>
-                      </w:r>
-                      <w:r>
-                        <w:rPr>
-                          <w:rFonts w:hint="default" w:ascii="Arial Narrow" w:hAnsi="Mangal" w:eastAsia="Microsoft YaHei"/>
-                          <w:color w:val="000000" w:themeColor="text1"/>
-                          <w:kern w:val="24"/>
-                          <w:sz w:val="14"/>
-                          <w:szCs w:val="14"/>
-                          <w:lang w:val="en-US"/>
-                          <w14:textFill>
-                            <w14:solidFill>
-                              <w14:schemeClr w14:val="tx1"/>
-                            </w14:solidFill>
-                          </w14:textFill>
-                        </w:rPr>
-                        <w:br w:type="textWrapping"/>
-                      </w:r>
-                      <w:r>
-                        <w:rPr>
-                          <w:rFonts w:ascii="Arial Narrow" w:hAnsi="Mangal" w:eastAsia="Microsoft YaHei"/>
-                          <w:color w:val="000000" w:themeColor="text1"/>
-                          <w:kern w:val="24"/>
-                          <w:sz w:val="16"/>
-                          <w:szCs w:val="16"/>
-                          <w14:textFill>
-                            <w14:solidFill>
-                              <w14:schemeClr w14:val="tx1"/>
-                            </w14:solidFill>
-                          </w14:textFill>
-                        </w:rPr>
-                        <w:t xml:space="preserve">   </w:t>
-                      </w:r>
-                    </w:p>
-                    <w:p>
-                      <w:pPr>
-                        <w:pStyle w:val="4"/>
-                        <w:kinsoku/>
-                        <w:overflowPunct w:val="0"/>
-                        <w:ind w:left="0"/>
-                        <w:jc w:val="left"/>
-                        <w:rPr>
-                          <w:rFonts w:hint="default"/>
-                          <w:lang w:val="en-US"/>
-                        </w:rPr>
-                      </w:pPr>
-                      <w:r>
-                        <w:rPr>
-                          <w:rFonts w:ascii="Arial Narrow" w:hAnsi="Mangal" w:eastAsia="Microsoft YaHei"/>
-                          <w:color w:val="000000" w:themeColor="text1"/>
-                          <w:kern w:val="24"/>
-                          <w:sz w:val="16"/>
-                          <w:szCs w:val="16"/>
-                          <w14:textFill>
-                            <w14:solidFill>
-                              <w14:schemeClr w14:val="tx1"/>
-                            </w14:solidFill>
-                          </w14:textFill>
-                        </w:rPr>
-                        <w:t xml:space="preserve">Civil Status: </w:t>
+                        <w:t xml:space="preserve">                    Civil Status: </w:t>
                       </w:r>
                       <w:r>
                         <w:rPr>
@@ -1192,21 +1094,246 @@
                         <w:overflowPunct w:val="0"/>
                         <w:ind w:left="0"/>
                         <w:jc w:val="left"/>
+                        <w:rPr>
+                          <w:rFonts w:hint="default" w:ascii="Arial Narrow" w:hAnsi="Mangal" w:eastAsia="Microsoft YaHei"/>
+                          <w:b/>
+                          <w:color w:val="000000" w:themeColor="text1"/>
+                          <w:kern w:val="24"/>
+                          <w:sz w:val="14"/>
+                          <w:szCs w:val="14"/>
+                          <w:u w:val="single"/>
+                          <w:lang w:val="en-US"/>
+                          <w14:textFill>
+                            <w14:solidFill>
+                              <w14:schemeClr w14:val="tx1"/>
+                            </w14:solidFill>
+                          </w14:textFill>
+                        </w:rPr>
                       </w:pPr>
                       <w:r>
                         <w:rPr>
-                          <w:rFonts w:ascii="Arial Narrow" w:hAnsi="Mangal" w:eastAsia="Microsoft YaHei"/>
+                          <w:rFonts w:hint="default" w:ascii="Arial Narrow" w:hAnsi="Mangal" w:eastAsia="Microsoft YaHei"/>
+                          <w:b w:val="0"/>
+                          <w:bCs/>
                           <w:color w:val="000000" w:themeColor="text1"/>
                           <w:kern w:val="24"/>
                           <w:sz w:val="16"/>
                           <w:szCs w:val="16"/>
-                          <w14:textFill>
-                            <w14:solidFill>
-                              <w14:schemeClr w14:val="tx1"/>
-                            </w14:solidFill>
-                          </w14:textFill>
-                        </w:rPr>
-                        <w:t>Weight</w:t>
+                          <w:lang w:val="en-US"/>
+                          <w14:textFill>
+                            <w14:solidFill>
+                              <w14:schemeClr w14:val="tx1"/>
+                            </w14:solidFill>
+                          </w14:textFill>
+                        </w:rPr>
+                        <w:t>Nationality</w:t>
+                      </w:r>
+                      <w:r>
+                        <w:rPr>
+                          <w:rFonts w:ascii="Arial Narrow" w:hAnsi="Mangal" w:eastAsia="Microsoft YaHei"/>
+                          <w:b/>
+                          <w:color w:val="000000" w:themeColor="text1"/>
+                          <w:kern w:val="24"/>
+                          <w:sz w:val="16"/>
+                          <w:szCs w:val="16"/>
+                          <w14:textFill>
+                            <w14:solidFill>
+                              <w14:schemeClr w14:val="tx1"/>
+                            </w14:solidFill>
+                          </w14:textFill>
+                        </w:rPr>
+                        <w:t xml:space="preserve">: </w:t>
+                      </w:r>
+                      <w:r>
+                        <w:rPr>
+                          <w:rFonts w:hint="default" w:ascii="Arial Narrow" w:hAnsi="Mangal" w:eastAsia="Microsoft YaHei"/>
+                          <w:b/>
+                          <w:color w:val="000000" w:themeColor="text1"/>
+                          <w:kern w:val="24"/>
+                          <w:sz w:val="16"/>
+                          <w:szCs w:val="16"/>
+                          <w:u w:val="single"/>
+                          <w:lang w:val="en-US"/>
+                          <w14:textFill>
+                            <w14:solidFill>
+                              <w14:schemeClr w14:val="tx1"/>
+                            </w14:solidFill>
+                          </w14:textFill>
+                        </w:rPr>
+                        <w:t>{{nationality}}</w:t>
+                      </w:r>
+                      <w:r>
+                        <w:rPr>
+                          <w:rFonts w:ascii="Arial Narrow" w:hAnsi="Mangal" w:eastAsia="Microsoft YaHei"/>
+                          <w:b/>
+                          <w:color w:val="000000" w:themeColor="text1"/>
+                          <w:kern w:val="24"/>
+                          <w:sz w:val="16"/>
+                          <w:szCs w:val="16"/>
+                          <w:u w:val="single"/>
+                          <w14:textFill>
+                            <w14:solidFill>
+                              <w14:schemeClr w14:val="tx1"/>
+                            </w14:solidFill>
+                          </w14:textFill>
+                        </w:rPr>
+                        <w:t xml:space="preserve"> </w:t>
+                      </w:r>
+                      <w:r>
+                        <w:rPr>
+                          <w:rFonts w:hint="default" w:ascii="Arial Narrow" w:hAnsi="Mangal" w:eastAsia="Microsoft YaHei"/>
+                          <w:b/>
+                          <w:color w:val="000000" w:themeColor="text1"/>
+                          <w:kern w:val="24"/>
+                          <w:sz w:val="16"/>
+                          <w:szCs w:val="16"/>
+                          <w:lang w:val="en-US"/>
+                          <w14:textFill>
+                            <w14:solidFill>
+                              <w14:schemeClr w14:val="tx1"/>
+                            </w14:solidFill>
+                          </w14:textFill>
+                        </w:rPr>
+                        <w:tab/>
+                      </w:r>
+                      <w:r>
+                        <w:rPr>
+                          <w:rFonts w:hint="default" w:ascii="Arial Narrow" w:hAnsi="Mangal" w:eastAsia="Microsoft YaHei"/>
+                          <w:b/>
+                          <w:color w:val="000000" w:themeColor="text1"/>
+                          <w:kern w:val="24"/>
+                          <w:sz w:val="16"/>
+                          <w:szCs w:val="16"/>
+                          <w:lang w:val="en-US"/>
+                          <w14:textFill>
+                            <w14:solidFill>
+                              <w14:schemeClr w14:val="tx1"/>
+                            </w14:solidFill>
+                          </w14:textFill>
+                        </w:rPr>
+                        <w:t xml:space="preserve">                    </w:t>
+                      </w:r>
+                      <w:r>
+                        <w:rPr>
+                          <w:rFonts w:hint="default" w:ascii="Arial Narrow" w:hAnsi="Mangal" w:eastAsia="Microsoft YaHei"/>
+                          <w:b w:val="0"/>
+                          <w:bCs/>
+                          <w:color w:val="000000" w:themeColor="text1"/>
+                          <w:kern w:val="24"/>
+                          <w:sz w:val="14"/>
+                          <w:szCs w:val="14"/>
+                          <w:u w:val="none"/>
+                          <w:lang w:val="en-US"/>
+                          <w14:textFill>
+                            <w14:solidFill>
+                              <w14:schemeClr w14:val="tx1"/>
+                            </w14:solidFill>
+                          </w14:textFill>
+                        </w:rPr>
+                        <w:t>W</w:t>
+                      </w:r>
+                      <w:r>
+                        <w:rPr>
+                          <w:rFonts w:ascii="Arial Narrow" w:hAnsi="Mangal" w:eastAsia="Microsoft YaHei"/>
+                          <w:b w:val="0"/>
+                          <w:bCs/>
+                          <w:color w:val="000000" w:themeColor="text1"/>
+                          <w:kern w:val="24"/>
+                          <w:sz w:val="16"/>
+                          <w:szCs w:val="16"/>
+                          <w14:textFill>
+                            <w14:solidFill>
+                              <w14:schemeClr w14:val="tx1"/>
+                            </w14:solidFill>
+                          </w14:textFill>
+                        </w:rPr>
+                        <w:t>eight</w:t>
+                      </w:r>
+                      <w:r>
+                        <w:rPr>
+                          <w:rFonts w:ascii="Arial Narrow" w:hAnsi="Mangal" w:eastAsia="Microsoft YaHei"/>
+                          <w:b/>
+                          <w:color w:val="000000" w:themeColor="text1"/>
+                          <w:kern w:val="24"/>
+                          <w:sz w:val="16"/>
+                          <w:szCs w:val="16"/>
+                          <w14:textFill>
+                            <w14:solidFill>
+                              <w14:schemeClr w14:val="tx1"/>
+                            </w14:solidFill>
+                          </w14:textFill>
+                        </w:rPr>
+                        <w:t xml:space="preserve">: </w:t>
+                      </w:r>
+                      <w:r>
+                        <w:rPr>
+                          <w:rFonts w:hint="default" w:ascii="Arial Narrow" w:hAnsi="Mangal" w:eastAsia="Microsoft YaHei"/>
+                          <w:b/>
+                          <w:color w:val="000000" w:themeColor="text1"/>
+                          <w:kern w:val="24"/>
+                          <w:sz w:val="16"/>
+                          <w:szCs w:val="16"/>
+                          <w:lang w:val="en-US"/>
+                          <w14:textFill>
+                            <w14:solidFill>
+                              <w14:schemeClr w14:val="tx1"/>
+                            </w14:solidFill>
+                          </w14:textFill>
+                        </w:rPr>
+                        <w:t>{{weight}} KGS.</w:t>
+                      </w:r>
+                    </w:p>
+                    <w:p>
+                      <w:pPr>
+                        <w:pStyle w:val="4"/>
+                        <w:kinsoku/>
+                        <w:overflowPunct w:val="0"/>
+                        <w:jc w:val="left"/>
+                        <w:rPr>
+                          <w:rFonts w:hint="default" w:ascii="Arial Narrow" w:hAnsi="Mangal" w:eastAsia="Microsoft YaHei"/>
+                          <w:b/>
+                          <w:color w:val="000000" w:themeColor="text1"/>
+                          <w:kern w:val="24"/>
+                          <w:sz w:val="16"/>
+                          <w:szCs w:val="16"/>
+                          <w:lang w:val="en-US"/>
+                          <w14:textFill>
+                            <w14:solidFill>
+                              <w14:schemeClr w14:val="tx1"/>
+                            </w14:solidFill>
+                          </w14:textFill>
+                        </w:rPr>
+                      </w:pPr>
+                      <w:r>
+                        <w:rPr>
+                          <w:rFonts w:hint="default" w:ascii="Arial Narrow" w:hAnsi="Mangal" w:eastAsia="Microsoft YaHei"/>
+                          <w:color w:val="000000" w:themeColor="text1"/>
+                          <w:kern w:val="24"/>
+                          <w:sz w:val="16"/>
+                          <w:szCs w:val="16"/>
+                          <w:lang w:val="en-US"/>
+                          <w14:textFill>
+                            <w14:solidFill>
+                              <w14:schemeClr w14:val="tx1"/>
+                            </w14:solidFill>
+                          </w14:textFill>
+                        </w:rPr>
+                        <w:t>H</w:t>
+                      </w:r>
+                      <w:r>
+                        <w:rPr>
+                          <w:rFonts w:ascii="Arial Narrow" w:hAnsi="Mangal" w:eastAsia="Microsoft YaHei"/>
+                          <w:color w:val="000000" w:themeColor="text1"/>
+                          <w:kern w:val="24"/>
+                          <w:sz w:val="16"/>
+                          <w:szCs w:val="16"/>
+                          <w14:textFill>
+                            <w14:solidFill>
+                              <w14:schemeClr w14:val="tx1"/>
+                            </w14:solidFill>
+                          </w14:textFill>
+                        </w:rPr>
+                        <w:t>eight</w:t>
                       </w:r>
                       <w:r>
                         <w:rPr>
@@ -1239,23 +1366,151 @@
                             </w14:solidFill>
                           </w14:textFill>
                         </w:rPr>
-                        <w:t>{{weight}}</w:t>
+                        <w:t>{{height}}</w:t>
                       </w:r>
                       <w:r>
                         <w:rPr>
+                          <w:rFonts w:hint="default" w:ascii="Arial Narrow" w:hAnsi="Mangal" w:eastAsia="Microsoft YaHei"/>
+                          <w:b/>
+                          <w:color w:val="000000" w:themeColor="text1"/>
+                          <w:kern w:val="24"/>
+                          <w:sz w:val="14"/>
+                          <w:szCs w:val="14"/>
+                          <w:u w:val="none"/>
+                          <w:lang w:val="en-US"/>
+                          <w14:textFill>
+                            <w14:solidFill>
+                              <w14:schemeClr w14:val="tx1"/>
+                            </w14:solidFill>
+                          </w14:textFill>
+                        </w:rPr>
+                        <w:t xml:space="preserve">                                            </w:t>
+                      </w:r>
+                      <w:r>
+                        <w:rPr>
+                          <w:rFonts w:hint="default" w:ascii="Arial Narrow" w:hAnsi="Mangal" w:eastAsia="Microsoft YaHei"/>
+                          <w:b w:val="0"/>
+                          <w:bCs/>
+                          <w:color w:val="000000" w:themeColor="text1"/>
+                          <w:kern w:val="24"/>
+                          <w:sz w:val="14"/>
+                          <w:szCs w:val="14"/>
+                          <w:u w:val="single"/>
+                          <w:lang w:val="en-US"/>
+                          <w14:textFill>
+                            <w14:solidFill>
+                              <w14:schemeClr w14:val="tx1"/>
+                            </w14:solidFill>
+                          </w14:textFill>
+                        </w:rPr>
+                        <w:t>Exp. Date</w:t>
+                      </w:r>
+                      <w:r>
+                        <w:rPr>
                           <w:rFonts w:ascii="Arial Narrow" w:hAnsi="Mangal" w:eastAsia="Microsoft YaHei"/>
-                          <w:b/>
+                          <w:b w:val="0"/>
+                          <w:bCs/>
                           <w:color w:val="000000" w:themeColor="text1"/>
                           <w:kern w:val="24"/>
                           <w:sz w:val="16"/>
                           <w:szCs w:val="16"/>
-                          <w14:textFill>
-                            <w14:solidFill>
-                              <w14:schemeClr w14:val="tx1"/>
-                            </w14:solidFill>
-                          </w14:textFill>
-                        </w:rPr>
-                        <w:t xml:space="preserve"> KLS.</w:t>
+                          <w:u w:val="single"/>
+                          <w14:textFill>
+                            <w14:solidFill>
+                              <w14:schemeClr w14:val="tx1"/>
+                            </w14:solidFill>
+                          </w14:textFill>
+                        </w:rPr>
+                        <w:t xml:space="preserve">: </w:t>
+                      </w:r>
+                      <w:r>
+                        <w:rPr>
+                          <w:rFonts w:hint="default" w:ascii="Arial Narrow" w:hAnsi="Mangal" w:eastAsia="Microsoft YaHei"/>
+                          <w:b/>
+                          <w:bCs w:val="0"/>
+                          <w:color w:val="000000" w:themeColor="text1"/>
+                          <w:kern w:val="24"/>
+                          <w:sz w:val="16"/>
+                          <w:szCs w:val="16"/>
+                          <w:u w:val="single"/>
+                          <w:lang w:val="en-US"/>
+                          <w14:textFill>
+                            <w14:solidFill>
+                              <w14:schemeClr w14:val="tx1"/>
+                            </w14:solidFill>
+                          </w14:textFill>
+                        </w:rPr>
+                        <w:t>{{expiration}}</w:t>
+                      </w:r>
+                      <w:r>
+                        <w:rPr>
+                          <w:rFonts w:hint="default" w:ascii="Arial Narrow" w:hAnsi="Mangal" w:eastAsia="Microsoft YaHei"/>
+                          <w:b w:val="0"/>
+                          <w:bCs/>
+                          <w:color w:val="000000" w:themeColor="text1"/>
+                          <w:kern w:val="24"/>
+                          <w:sz w:val="16"/>
+                          <w:szCs w:val="16"/>
+                          <w:u w:val="single"/>
+                          <w:lang w:val="en-US"/>
+                          <w14:textFill>
+                            <w14:solidFill>
+                              <w14:schemeClr w14:val="tx1"/>
+                            </w14:solidFill>
+                          </w14:textFill>
+                        </w:rPr>
+                        <w:t xml:space="preserve"> </w:t>
+                      </w:r>
+                      <w:r>
+                        <w:rPr>
+                          <w:rFonts w:hint="default" w:ascii="Arial Narrow" w:hAnsi="Mangal" w:eastAsia="Microsoft YaHei"/>
+                          <w:b/>
+                          <w:color w:val="000000" w:themeColor="text1"/>
+                          <w:kern w:val="24"/>
+                          <w:sz w:val="16"/>
+                          <w:szCs w:val="16"/>
+                          <w:lang w:val="en-US"/>
+                          <w14:textFill>
+                            <w14:solidFill>
+                              <w14:schemeClr w14:val="tx1"/>
+                            </w14:solidFill>
+                          </w14:textFill>
+                        </w:rPr>
+                        <w:t xml:space="preserve">  </w:t>
+                      </w:r>
+                      <w:r>
+                        <w:rPr>
+                          <w:rFonts w:hint="default" w:ascii="Arial Narrow" w:hAnsi="Mangal" w:eastAsia="Microsoft YaHei"/>
+                          <w:b/>
+                          <w:color w:val="000000" w:themeColor="text1"/>
+                          <w:kern w:val="24"/>
+                          <w:sz w:val="16"/>
+                          <w:szCs w:val="16"/>
+                          <w:lang w:val="en-US"/>
+                          <w14:textFill>
+                            <w14:solidFill>
+                              <w14:schemeClr w14:val="tx1"/>
+                            </w14:solidFill>
+                          </w14:textFill>
+                        </w:rPr>
+                        <w:tab/>
+                      </w:r>
+                      <w:r>
+                        <w:rPr>
+                          <w:rFonts w:hint="default" w:ascii="Arial Narrow" w:hAnsi="Mangal" w:eastAsia="Microsoft YaHei"/>
+                          <w:b/>
+                          <w:color w:val="000000" w:themeColor="text1"/>
+                          <w:kern w:val="24"/>
+                          <w:sz w:val="16"/>
+                          <w:szCs w:val="16"/>
+                          <w:lang w:val="en-US"/>
+                          <w14:textFill>
+                            <w14:solidFill>
+                              <w14:schemeClr w14:val="tx1"/>
+                            </w14:solidFill>
+                          </w14:textFill>
+                        </w:rPr>
+                        <w:t xml:space="preserve"> </w:t>
                       </w:r>
                     </w:p>
                     <w:p>
@@ -1264,45 +1519,7 @@
                         <w:kinsoku/>
                         <w:overflowPunct w:val="0"/>
                         <w:ind w:left="0"/>
-                        <w:jc w:val="left"/>
-                        <w:rPr>
-                          <w:rFonts w:hint="default"/>
-                          <w:lang w:val="en-US"/>
-                        </w:rPr>
-                      </w:pPr>
-                      <w:r>
-                        <w:rPr>
-                          <w:rFonts w:ascii="Arial Narrow" w:hAnsi="Mangal" w:eastAsia="Microsoft YaHei"/>
-                          <w:color w:val="000000" w:themeColor="text1"/>
-                          <w:kern w:val="24"/>
-                          <w:sz w:val="14"/>
-                          <w:szCs w:val="14"/>
-                          <w14:textFill>
-                            <w14:solidFill>
-                              <w14:schemeClr w14:val="tx1"/>
-                            </w14:solidFill>
-                          </w14:textFill>
-                        </w:rPr>
-                        <w:t xml:space="preserve">Exp. Date: </w:t>
-                      </w:r>
-                      <w:r>
-                        <w:rPr>
-                          <w:rFonts w:ascii="Arial Narrow" w:hAnsi="Mangal" w:eastAsia="Microsoft YaHei"/>
-                          <w:b/>
-                          <w:color w:val="000000" w:themeColor="text1"/>
-                          <w:kern w:val="24"/>
-                          <w:sz w:val="14"/>
-                          <w:szCs w:val="14"/>
-                          <w:u w:val="single"/>
-                          <w14:textFill>
-                            <w14:solidFill>
-                              <w14:schemeClr w14:val="tx1"/>
-                            </w14:solidFill>
-                          </w14:textFill>
-                        </w:rPr>
-                        <w:t xml:space="preserve"> </w:t>
-                      </w:r>
-                      <w:r>
+                        <w:jc w:val="both"/>
                         <w:rPr>
                           <w:rFonts w:hint="default" w:ascii="Arial Narrow" w:hAnsi="Mangal" w:eastAsia="Microsoft YaHei"/>
                           <w:b/>
@@ -1318,7 +1535,225 @@
                             </w14:solidFill>
                           </w14:textFill>
                         </w:rPr>
-                        <w:t>{{expiration}}</w:t>
+                      </w:pPr>
+                      <w:r>
+                        <w:rPr>
+                          <w:rFonts w:ascii="Arial Narrow" w:hAnsi="Mangal" w:eastAsia="Microsoft YaHei"/>
+                          <w:color w:val="000000" w:themeColor="text1"/>
+                          <w:kern w:val="24"/>
+                          <w:sz w:val="16"/>
+                          <w:szCs w:val="16"/>
+                          <w14:textFill>
+                            <w14:solidFill>
+                              <w14:schemeClr w14:val="tx1"/>
+                            </w14:solidFill>
+                          </w14:textFill>
+                        </w:rPr>
+                        <w:t xml:space="preserve">Date Issued: </w:t>
+                      </w:r>
+                      <w:r>
+                        <w:rPr>
+                          <w:rFonts w:hint="default" w:ascii="Arial Narrow" w:hAnsi="Mangal" w:eastAsia="Microsoft YaHei"/>
+                          <w:b/>
+                          <w:color w:val="000000" w:themeColor="text1"/>
+                          <w:kern w:val="24"/>
+                          <w:sz w:val="14"/>
+                          <w:szCs w:val="14"/>
+                          <w:u w:val="single"/>
+                          <w:lang w:val="en-US"/>
+                          <w14:textFill>
+                            <w14:solidFill>
+                              <w14:schemeClr w14:val="tx1"/>
+                            </w14:solidFill>
+                          </w14:textFill>
+                        </w:rPr>
+                        <w:t>{{date_issued}}</w:t>
+                      </w:r>
+                    </w:p>
+                    <w:p>
+                      <w:pPr>
+                        <w:pStyle w:val="4"/>
+                        <w:kinsoku/>
+                        <w:ind w:left="0"/>
+                        <w:jc w:val="center"/>
+                        <w:rPr>
+                          <w:rFonts w:hint="default" w:ascii="Arial Narrow" w:hAnsi="Mangal" w:eastAsia="Microsoft YaHei"/>
+                          <w:b/>
+                          <w:color w:val="000000" w:themeColor="text1"/>
+                          <w:kern w:val="24"/>
+                          <w:sz w:val="14"/>
+                          <w:szCs w:val="14"/>
+                          <w:lang w:val="en-US"/>
+                          <w14:textFill>
+                            <w14:solidFill>
+                              <w14:schemeClr w14:val="tx1"/>
+                            </w14:solidFill>
+                          </w14:textFill>
+                        </w:rPr>
+                      </w:pPr>
+                    </w:p>
+                    <w:p>
+                      <w:pPr>
+                        <w:pStyle w:val="4"/>
+                        <w:kinsoku/>
+                        <w:ind w:left="0"/>
+                        <w:jc w:val="both"/>
+                        <w:rPr>
+                          <w:rFonts w:hint="default" w:ascii="Arial Narrow" w:hAnsi="Mangal" w:eastAsia="Microsoft YaHei"/>
+                          <w:b/>
+                          <w:color w:val="000000" w:themeColor="text1"/>
+                          <w:kern w:val="24"/>
+                          <w:sz w:val="14"/>
+                          <w:szCs w:val="14"/>
+                          <w:lang w:val="en-US"/>
+                          <w14:textFill>
+                            <w14:solidFill>
+                              <w14:schemeClr w14:val="tx1"/>
+                            </w14:solidFill>
+                          </w14:textFill>
+                        </w:rPr>
+                      </w:pPr>
+                    </w:p>
+                    <w:p>
+                      <w:pPr>
+                        <w:pStyle w:val="4"/>
+                        <w:kinsoku/>
+                        <w:ind w:left="0"/>
+                        <w:jc w:val="center"/>
+                        <w:rPr>
+                          <w:rFonts w:hint="default" w:ascii="Arial Narrow" w:hAnsi="Mangal" w:eastAsia="Microsoft YaHei"/>
+                          <w:b/>
+                          <w:color w:val="000000" w:themeColor="text1"/>
+                          <w:kern w:val="24"/>
+                          <w:sz w:val="14"/>
+                          <w:szCs w:val="14"/>
+                          <w:lang w:val="en-US"/>
+                          <w14:textFill>
+                            <w14:solidFill>
+                              <w14:schemeClr w14:val="tx1"/>
+                            </w14:solidFill>
+                          </w14:textFill>
+                        </w:rPr>
+                      </w:pPr>
+                    </w:p>
+                    <w:p>
+                      <w:pPr>
+                        <w:pStyle w:val="4"/>
+                        <w:kinsoku/>
+                        <w:ind w:left="0"/>
+                        <w:jc w:val="center"/>
+                      </w:pPr>
+                      <w:r>
+                        <w:rPr>
+                          <w:rFonts w:hint="default" w:ascii="Arial Narrow" w:hAnsi="Mangal" w:eastAsia="Microsoft YaHei"/>
+                          <w:b/>
+                          <w:color w:val="000000" w:themeColor="text1"/>
+                          <w:kern w:val="24"/>
+                          <w:sz w:val="14"/>
+                          <w:szCs w:val="14"/>
+                          <w:lang w:val="en-US"/>
+                          <w14:textFill>
+                            <w14:solidFill>
+                              <w14:schemeClr w14:val="tx1"/>
+                            </w14:solidFill>
+                          </w14:textFill>
+                        </w:rPr>
+                        <w:br w:type="textWrapping"/>
+                      </w:r>
+                      <w:r>
+                        <w:rPr>
+                          <w:rFonts w:hint="default" w:ascii="Arial Narrow" w:hAnsi="Mangal" w:eastAsia="Microsoft YaHei"/>
+                          <w:b/>
+                          <w:color w:val="000000" w:themeColor="text1"/>
+                          <w:kern w:val="24"/>
+                          <w:sz w:val="14"/>
+                          <w:szCs w:val="14"/>
+                          <w:lang w:val="en-US"/>
+                          <w14:textFill>
+                            <w14:solidFill>
+                              <w14:schemeClr w14:val="tx1"/>
+                            </w14:solidFill>
+                          </w14:textFill>
+                        </w:rPr>
+                        <w:t>{{emergency_contact_name}} / {{emergency_contact_number}}</w:t>
+                      </w:r>
+                      <w:r>
+                        <w:rPr>
+                          <w:rFonts w:ascii="Arial Narrow" w:hAnsi="Mangal" w:eastAsia="Microsoft YaHei"/>
+                          <w:b/>
+                          <w:color w:val="000000" w:themeColor="text1"/>
+                          <w:kern w:val="24"/>
+                          <w:sz w:val="14"/>
+                          <w:szCs w:val="14"/>
+                          <w14:textFill>
+                            <w14:solidFill>
+                              <w14:schemeClr w14:val="tx1"/>
+                            </w14:solidFill>
+                          </w14:textFill>
+                        </w:rPr>
+                        <w:br w:type="textWrapping"/>
+                      </w:r>
+                      <w:r>
+                        <w:rPr>
+                          <w:rFonts w:ascii="Arial Narrow" w:hAnsi="Mangal" w:eastAsia="Microsoft YaHei"/>
+                          <w:color w:val="000000" w:themeColor="text1"/>
+                          <w:kern w:val="24"/>
+                          <w:sz w:val="14"/>
+                          <w:szCs w:val="14"/>
+                          <w14:textFill>
+                            <w14:solidFill>
+                              <w14:schemeClr w14:val="tx1"/>
+                            </w14:solidFill>
+                          </w14:textFill>
+                        </w:rPr>
+                        <w:t>Person In case of Emergency/ Contact No</w:t>
+                      </w:r>
+                      <w:r>
+                        <w:rPr>
+                          <w:rFonts w:hint="default" w:ascii="Arial Narrow" w:hAnsi="Mangal" w:eastAsia="Microsoft YaHei"/>
+                          <w:color w:val="000000" w:themeColor="text1"/>
+                          <w:kern w:val="24"/>
+                          <w:sz w:val="14"/>
+                          <w:szCs w:val="14"/>
+                          <w:lang w:val="en-US"/>
+                          <w14:textFill>
+                            <w14:solidFill>
+                              <w14:schemeClr w14:val="tx1"/>
+                            </w14:solidFill>
+                          </w14:textFill>
+                        </w:rPr>
+                        <w:t>:</w:t>
+                      </w:r>
+                      <w:r>
+                        <w:rPr>
+                          <w:rFonts w:hint="default" w:ascii="Arial Narrow" w:hAnsi="Mangal" w:eastAsia="Microsoft YaHei"/>
+                          <w:color w:val="000000" w:themeColor="text1"/>
+                          <w:kern w:val="24"/>
+                          <w:sz w:val="14"/>
+                          <w:szCs w:val="14"/>
+                          <w:lang w:val="en-US"/>
+                          <w14:textFill>
+                            <w14:solidFill>
+                              <w14:schemeClr w14:val="tx1"/>
+                            </w14:solidFill>
+                          </w14:textFill>
+                        </w:rPr>
+                        <w:br w:type="textWrapping"/>
+                      </w:r>
+                      <w:r>
+                        <w:rPr>
+                          <w:rFonts w:ascii="Arial Narrow" w:hAnsi="Mangal" w:eastAsia="Microsoft YaHei"/>
+                          <w:color w:val="000000" w:themeColor="text1"/>
+                          <w:kern w:val="24"/>
+                          <w:sz w:val="16"/>
+                          <w:szCs w:val="16"/>
+                          <w14:textFill>
+                            <w14:solidFill>
+                              <w14:schemeClr w14:val="tx1"/>
+                            </w14:solidFill>
+                          </w14:textFill>
+                        </w:rPr>
+                        <w:t xml:space="preserve">   </w:t>
                       </w:r>
                     </w:p>
                     <w:p>
@@ -1345,7 +1780,7 @@
         <mc:AlternateContent>
           <mc:Choice Requires="wpg">
             <w:drawing>
-              <wp:anchor distT="0" distB="0" distL="114300" distR="114300" simplePos="0" relativeHeight="251665408" behindDoc="0" locked="0" layoutInCell="1" allowOverlap="1">
+              <wp:anchor distT="0" distB="0" distL="114300" distR="114300" simplePos="0" relativeHeight="251664384" behindDoc="0" locked="0" layoutInCell="1" allowOverlap="1">
                 <wp:simplePos x="0" y="0"/>
                 <wp:positionH relativeFrom="column">
                   <wp:posOffset>34290</wp:posOffset>
@@ -1356,7 +1791,7 @@
                 <wp:extent cx="3286125" cy="2122170"/>
                 <wp:effectExtent l="10160" t="0" r="10795" b="0"/>
                 <wp:wrapNone/>
-                <wp:docPr id="17" name="Group 17"/>
+                <wp:docPr id="19" name="Group 19"/>
                 <wp:cNvGraphicFramePr/>
                 <a:graphic xmlns:a="http://schemas.openxmlformats.org/drawingml/2006/main">
                   <a:graphicData uri="http://schemas.microsoft.com/office/word/2010/wordprocessingGroup">
@@ -1378,7 +1813,7 @@
                           </pic:cNvPicPr>
                         </pic:nvPicPr>
                         <pic:blipFill>
-                          <a:blip r:embed="rId4">
+                          <a:blip r:embed="rId6">
                             <a:extLst>
                               <a:ext uri="{28A0092B-C50C-407E-A947-70E740481C1C}">
                                 <a14:useLocalDpi xmlns:a14="http://schemas.microsoft.com/office/drawing/2010/main" val="0"/>
@@ -1578,6 +2013,7 @@
                                   <w:kern w:val="24"/>
                                   <w:sz w:val="16"/>
                                   <w:szCs w:val="16"/>
+                                  <w:u w:val="single"/>
                                   <w:lang w:val="en-US"/>
                                   <w14:textFill>
                                     <w14:solidFill>
@@ -1689,8 +2125,10 @@
                                 <w:ind w:left="0" w:right="0" w:firstLine="0"/>
                                 <w:jc w:val="center"/>
                                 <w:rPr>
+                                  <w:rFonts w:hint="default"/>
                                   <w:sz w:val="22"/>
                                   <w:szCs w:val="22"/>
+                                  <w:lang w:val="en-US"/>
                                 </w:rPr>
                               </w:pPr>
                               <w:r>
@@ -1826,7 +2264,24 @@
                                     </w14:solidFill>
                                   </w14:textFill>
                                 </w:rPr>
-                                <w:t xml:space="preserve">                                                                     BIRTHDAY</w:t>
+                                <w:t xml:space="preserve">                                                                     BIRTHDA</w:t>
+                              </w:r>
+                              <w:r>
+                                <w:rPr>
+                                  <w:rFonts w:hint="default" w:ascii="Arial Narrow" w:hAnsi="Mangal" w:eastAsia="Microsoft YaHei"/>
+                                  <w:b/>
+                                  <w:color w:val="000000" w:themeColor="text1"/>
+                                  <w:kern w:val="24"/>
+                                  <w:sz w:val="11"/>
+                                  <w:szCs w:val="11"/>
+                                  <w:lang w:val="en-US"/>
+                                  <w14:textFill>
+                                    <w14:solidFill>
+                                      <w14:schemeClr w14:val="tx1"/>
+                                    </w14:solidFill>
+                                  </w14:textFill>
+                                </w:rPr>
+                                <w:t>TE</w:t>
                               </w:r>
                             </w:p>
                             <w:p>
@@ -1891,7 +2346,23 @@
                                     </w14:solidFill>
                                   </w14:textFill>
                                 </w:rPr>
-                                <w:t>Address</w:t>
+                                <w:t>A</w:t>
+                              </w:r>
+                              <w:r>
+                                <w:rPr>
+                                  <w:rFonts w:hint="default" w:ascii="Arial Narrow" w:hAnsi="Mangal" w:eastAsia="Microsoft YaHei"/>
+                                  <w:color w:val="000000" w:themeColor="text1"/>
+                                  <w:kern w:val="24"/>
+                                  <w:sz w:val="16"/>
+                                  <w:szCs w:val="16"/>
+                                  <w:lang w:val="en-US"/>
+                                  <w14:textFill>
+                                    <w14:solidFill>
+                                      <w14:schemeClr w14:val="tx1"/>
+                                    </w14:solidFill>
+                                  </w14:textFill>
+                                </w:rPr>
+                                <w:t>DDRESS</w:t>
                               </w:r>
                               <w:r>
                                 <w:rPr>
@@ -1953,7 +2424,7 @@
                           </pic:cNvPicPr>
                         </pic:nvPicPr>
                         <pic:blipFill>
-                          <a:blip r:embed="rId6" cstate="print">
+                          <a:blip r:embed="rId7" cstate="print">
                             <a:extLst>
                               <a:ext uri="{28A0092B-C50C-407E-A947-70E740481C1C}">
                                 <a14:useLocalDpi xmlns:a14="http://schemas.microsoft.com/office/drawing/2010/main" val="0"/>
@@ -1982,12 +2453,12 @@
           </mc:Choice>
           <mc:Fallback>
             <w:pict>
-              <v:group id="_x0000_s1026" o:spid="_x0000_s1026" o:spt="203" style="position:absolute;left:0pt;margin-left:2.7pt;margin-top:24.45pt;height:167.1pt;width:258.75pt;z-index:251665408;mso-width-relative:page;mso-height-relative:page;" coordorigin="12017,5149" coordsize="5175,3342" o:gfxdata="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">
+              <v:group id="_x0000_s1026" o:spid="_x0000_s1026" o:spt="203" style="position:absolute;left:0pt;margin-left:2.7pt;margin-top:24.45pt;height:167.1pt;width:258.75pt;z-index:251664384;mso-width-relative:page;mso-height-relative:page;" coordorigin="12017,5149" coordsize="5175,3342" o:gfxdata="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">
                 <o:lock v:ext="edit" aspectratio="f"/>
                 <v:shape id="Picture 205" o:spid="_x0000_s1026" o:spt="75" type="#_x0000_t75" style="position:absolute;left:12101;top:5149;height:2802;width:2367;" filled="f" o:preferrelative="t" stroked="f" coordsize="21600,21600" o:gfxdata="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">
                   <v:fill on="f" focussize="0,0"/>
                   <v:stroke on="f"/>
-                  <v:imagedata r:id="rId4" o:title=""/>
+                  <v:imagedata r:id="rId6" o:title=""/>
                   <o:lock v:ext="edit" aspectratio="t"/>
                 </v:shape>
                 <v:shape id="Freeform 206" o:spid="_x0000_s1026" o:spt="100" style="position:absolute;left:12500;top:5997;height:1432;width:1479;mso-wrap-style:none;v-text-anchor:middle;" fillcolor="#FFFFFF [3201]" filled="t" stroked="t" coordsize="21600,21600" o:gfxdata="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" path="m0,0l21600,0,21600,21600,0,21600,0,0xe">
@@ -2066,6 +2537,7 @@
                             <w:kern w:val="24"/>
                             <w:sz w:val="16"/>
                             <w:szCs w:val="16"/>
+                            <w:u w:val="single"/>
                             <w:lang w:val="en-US"/>
                             <w14:textFill>
                               <w14:solidFill>
@@ -2163,8 +2635,10 @@
                           <w:ind w:left="0" w:right="0" w:firstLine="0"/>
                           <w:jc w:val="center"/>
                           <w:rPr>
+                            <w:rFonts w:hint="default"/>
                             <w:sz w:val="22"/>
                             <w:szCs w:val="22"/>
+                            <w:lang w:val="en-US"/>
                           </w:rPr>
                         </w:pPr>
                         <w:r>
@@ -2300,7 +2774,24 @@
                               </w14:solidFill>
                             </w14:textFill>
                           </w:rPr>
-                          <w:t xml:space="preserve">                                                                     BIRTHDAY</w:t>
+                          <w:t xml:space="preserve">                                                                     BIRTHDA</w:t>
+                        </w:r>
+                        <w:r>
+                          <w:rPr>
+                            <w:rFonts w:hint="default" w:ascii="Arial Narrow" w:hAnsi="Mangal" w:eastAsia="Microsoft YaHei"/>
+                            <w:b/>
+                            <w:color w:val="000000" w:themeColor="text1"/>
+                            <w:kern w:val="24"/>
+                            <w:sz w:val="11"/>
+                            <w:szCs w:val="11"/>
+                            <w:lang w:val="en-US"/>
+                            <w14:textFill>
+                              <w14:solidFill>
+                                <w14:schemeClr w14:val="tx1"/>
+                              </w14:solidFill>
+                            </w14:textFill>
+                          </w:rPr>
+                          <w:t>TE</w:t>
                         </w:r>
                       </w:p>
                       <w:p>
@@ -2365,7 +2856,23 @@
                               </w14:solidFill>
                             </w14:textFill>
                           </w:rPr>
-                          <w:t>Address</w:t>
+                          <w:t>A</w:t>
+                        </w:r>
+                        <w:r>
+                          <w:rPr>
+                            <w:rFonts w:hint="default" w:ascii="Arial Narrow" w:hAnsi="Mangal" w:eastAsia="Microsoft YaHei"/>
+                            <w:color w:val="000000" w:themeColor="text1"/>
+                            <w:kern w:val="24"/>
+                            <w:sz w:val="16"/>
+                            <w:szCs w:val="16"/>
+                            <w:lang w:val="en-US"/>
+                            <w14:textFill>
+                              <w14:solidFill>
+                                <w14:schemeClr w14:val="tx1"/>
+                              </w14:solidFill>
+                            </w14:textFill>
+                          </w:rPr>
+                          <w:t>DDRESS</w:t>
                         </w:r>
                         <w:r>
                           <w:rPr>
@@ -2419,7 +2926,7 @@
                 <v:shape id="Picture 2" o:spid="_x0000_s1026" o:spt="75" type="#_x0000_t75" style="position:absolute;left:15506;top:5173;height:483;width:490;" filled="f" o:preferrelative="t" stroked="f" coordsize="21600,21600" o:gfxdata="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">
                   <v:fill on="f" focussize="0,0"/>
                   <v:stroke on="f"/>
-                  <v:imagedata r:id="rId6" o:title=""/>
+                  <v:imagedata r:id="rId7" o:title=""/>
                   <o:lock v:ext="edit" aspectratio="t"/>
                 </v:shape>
               </v:group>
@@ -2431,7 +2938,7 @@
         <mc:AlternateContent>
           <mc:Choice Requires="wps">
             <w:drawing>
-              <wp:anchor distT="0" distB="0" distL="114300" distR="114300" simplePos="0" relativeHeight="251664384" behindDoc="0" locked="0" layoutInCell="1" allowOverlap="1">
+              <wp:anchor distT="0" distB="0" distL="114300" distR="114300" simplePos="0" relativeHeight="251663360" behindDoc="0" locked="0" layoutInCell="1" allowOverlap="1">
                 <wp:simplePos x="0" y="0"/>
                 <wp:positionH relativeFrom="column">
                   <wp:posOffset>45085</wp:posOffset>
@@ -2440,7 +2947,7 @@
                   <wp:posOffset>260985</wp:posOffset>
                 </wp:positionV>
                 <wp:extent cx="3285490" cy="2099945"/>
-                <wp:effectExtent l="6350" t="6350" r="10160" b="27305"/>
+                <wp:effectExtent l="6350" t="6350" r="15240" b="12065"/>
                 <wp:wrapNone/>
                 <wp:docPr id="10" name="Freeform 212"/>
                 <wp:cNvGraphicFramePr/>
@@ -2520,7 +3027,7 @@
           </mc:Choice>
           <mc:Fallback>
             <w:pict>
-              <v:shape id="Freeform 212" o:spid="_x0000_s1026" o:spt="100" style="position:absolute;left:0pt;margin-left:3.55pt;margin-top:20.55pt;height:165.35pt;width:258.7pt;mso-wrap-style:none;z-index:251664384;v-text-anchor:middle;mso-width-relative:page;mso-height-relative:page;" fillcolor="#FFFFFF [3201]" filled="t" stroked="t" coordsize="21600,21600" o:gfxdata="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" path="m0,0l21600,0,21600,21600,0,21600,0,0xe">
+              <v:shape id="Freeform 212" o:spid="_x0000_s1026" o:spt="100" style="position:absolute;left:0pt;margin-left:3.55pt;margin-top:20.55pt;height:165.35pt;width:258.7pt;mso-wrap-style:none;z-index:251663360;v-text-anchor:middle;mso-width-relative:page;mso-height-relative:page;" fillcolor="#FFFFFF [3201]" filled="t" stroked="t" coordsize="21600,21600" o:gfxdata="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" path="m0,0l21600,0,21600,21600,0,21600,0,0xe">
                 <v:path o:connectlocs="1642745,0;3285490,1049972;1642745,2099945;0,1049972" o:connectangles="0,0,82,164"/>
                 <v:fill on="t" focussize="0,0"/>
                 <v:stroke weight="1pt" color="#000000 [3200]" miterlimit="8" joinstyle="miter"/>
@@ -2532,170 +3039,7 @@
           </mc:Fallback>
         </mc:AlternateContent>
       </w:r>
-      <w:r>
-        <w:drawing>
-          <wp:anchor distT="0" distB="0" distL="114300" distR="114300" simplePos="0" relativeHeight="251660288" behindDoc="0" locked="0" layoutInCell="1" allowOverlap="1">
-            <wp:simplePos x="0" y="0"/>
-            <wp:positionH relativeFrom="column">
-              <wp:posOffset>38735</wp:posOffset>
-            </wp:positionH>
-            <wp:positionV relativeFrom="paragraph">
-              <wp:posOffset>3797300</wp:posOffset>
-            </wp:positionV>
-            <wp:extent cx="3267075" cy="245110"/>
-            <wp:effectExtent l="12700" t="12700" r="22225" b="21590"/>
-            <wp:wrapNone/>
-            <wp:docPr id="7" name="Picture 208"/>
-            <wp:cNvGraphicFramePr>
-              <a:graphicFrameLocks xmlns:a="http://schemas.openxmlformats.org/drawingml/2006/main" noChangeAspect="1"/>
-            </wp:cNvGraphicFramePr>
-            <a:graphic xmlns:a="http://schemas.openxmlformats.org/drawingml/2006/main">
-              <a:graphicData uri="http://schemas.openxmlformats.org/drawingml/2006/picture">
-                <pic:pic xmlns:pic="http://schemas.openxmlformats.org/drawingml/2006/picture">
-                  <pic:nvPicPr>
-                    <pic:cNvPr id="7" name="Picture 208"/>
-                    <pic:cNvPicPr>
-                      <a:picLocks noChangeAspect="1"/>
-                    </pic:cNvPicPr>
-                  </pic:nvPicPr>
-                  <pic:blipFill>
-                    <a:blip r:embed="rId5">
-                      <a:lum/>
-                    </a:blip>
-                    <a:srcRect/>
-                    <a:stretch>
-                      <a:fillRect/>
-                    </a:stretch>
-                  </pic:blipFill>
-                  <pic:spPr>
-                    <a:xfrm>
-                      <a:off x="0" y="0"/>
-                      <a:ext cx="3267075" cy="245110"/>
-                    </a:xfrm>
-                    <a:prstGeom prst="rect">
-                      <a:avLst/>
-                    </a:prstGeom>
-                    <a:noFill/>
-                    <a:ln w="10080">
-                      <a:solidFill>
-                        <a:srgbClr val="666666"/>
-                      </a:solidFill>
-                      <a:prstDash val="solid"/>
-                    </a:ln>
-                  </pic:spPr>
-                </pic:pic>
-              </a:graphicData>
-            </a:graphic>
-          </wp:anchor>
-        </w:drawing>
-      </w:r>
-      <w:r>
-        <w:drawing>
-          <wp:anchor distT="0" distB="0" distL="114300" distR="114300" simplePos="0" relativeHeight="251662336" behindDoc="0" locked="0" layoutInCell="1" allowOverlap="1">
-            <wp:simplePos x="0" y="0"/>
-            <wp:positionH relativeFrom="column">
-              <wp:posOffset>129540</wp:posOffset>
-            </wp:positionH>
-            <wp:positionV relativeFrom="paragraph">
-              <wp:posOffset>4084320</wp:posOffset>
-            </wp:positionV>
-            <wp:extent cx="1492250" cy="504190"/>
-            <wp:effectExtent l="0" t="0" r="6350" b="3810"/>
-            <wp:wrapNone/>
-            <wp:docPr id="8" name="Picture 5"/>
-            <wp:cNvGraphicFramePr>
-              <a:graphicFrameLocks xmlns:a="http://schemas.openxmlformats.org/drawingml/2006/main" noChangeAspect="1"/>
-            </wp:cNvGraphicFramePr>
-            <a:graphic xmlns:a="http://schemas.openxmlformats.org/drawingml/2006/main">
-              <a:graphicData uri="http://schemas.openxmlformats.org/drawingml/2006/picture">
-                <pic:pic xmlns:pic="http://schemas.openxmlformats.org/drawingml/2006/picture">
-                  <pic:nvPicPr>
-                    <pic:cNvPr id="8" name="Picture 5"/>
-                    <pic:cNvPicPr>
-                      <a:picLocks noChangeAspect="1"/>
-                    </pic:cNvPicPr>
-                  </pic:nvPicPr>
-                  <pic:blipFill>
-                    <a:blip r:embed="rId7" cstate="print">
-                      <a:extLst>
-                        <a:ext uri="{28A0092B-C50C-407E-A947-70E740481C1C}">
-                          <a14:useLocalDpi xmlns:a14="http://schemas.microsoft.com/office/drawing/2010/main" val="0"/>
-                        </a:ext>
-                      </a:extLst>
-                    </a:blip>
-                    <a:srcRect l="4410" t="4950" b="16146"/>
-                    <a:stretch>
-                      <a:fillRect/>
-                    </a:stretch>
-                  </pic:blipFill>
-                  <pic:spPr>
-                    <a:xfrm>
-                      <a:off x="0" y="0"/>
-                      <a:ext cx="1492250" cy="504190"/>
-                    </a:xfrm>
-                    <a:prstGeom prst="rect">
-                      <a:avLst/>
-                    </a:prstGeom>
-                  </pic:spPr>
-                </pic:pic>
-              </a:graphicData>
-            </a:graphic>
-          </wp:anchor>
-        </w:drawing>
-      </w:r>
-      <w:r>
-        <w:drawing>
-          <wp:anchor distT="0" distB="0" distL="114300" distR="114300" simplePos="0" relativeHeight="251661312" behindDoc="0" locked="0" layoutInCell="1" allowOverlap="1">
-            <wp:simplePos x="0" y="0"/>
-            <wp:positionH relativeFrom="column">
-              <wp:posOffset>2009140</wp:posOffset>
-            </wp:positionH>
-            <wp:positionV relativeFrom="paragraph">
-              <wp:posOffset>3327400</wp:posOffset>
-            </wp:positionV>
-            <wp:extent cx="1371600" cy="1371600"/>
-            <wp:effectExtent l="0" t="0" r="0" b="0"/>
-            <wp:wrapNone/>
-            <wp:docPr id="4" name="Picture 4"/>
-            <wp:cNvGraphicFramePr>
-              <a:graphicFrameLocks xmlns:a="http://schemas.openxmlformats.org/drawingml/2006/main" noChangeAspect="1"/>
-            </wp:cNvGraphicFramePr>
-            <a:graphic xmlns:a="http://schemas.openxmlformats.org/drawingml/2006/main">
-              <a:graphicData uri="http://schemas.openxmlformats.org/drawingml/2006/picture">
-                <pic:pic xmlns:pic="http://schemas.openxmlformats.org/drawingml/2006/picture">
-                  <pic:nvPicPr>
-                    <pic:cNvPr id="4" name="Picture 4"/>
-                    <pic:cNvPicPr>
-                      <a:picLocks noChangeAspect="1"/>
-                    </pic:cNvPicPr>
-                  </pic:nvPicPr>
-                  <pic:blipFill>
-                    <a:blip r:embed="rId8" cstate="print">
-                      <a:extLst>
-                        <a:ext uri="{28A0092B-C50C-407E-A947-70E740481C1C}">
-                          <a14:useLocalDpi xmlns:a14="http://schemas.microsoft.com/office/drawing/2010/main" val="0"/>
-                        </a:ext>
-                      </a:extLst>
-                    </a:blip>
-                    <a:stretch>
-                      <a:fillRect/>
-                    </a:stretch>
-                  </pic:blipFill>
-                  <pic:spPr>
-                    <a:xfrm flipH="1">
-                      <a:off x="0" y="0"/>
-                      <a:ext cx="1371600" cy="1371600"/>
-                    </a:xfrm>
-                    <a:prstGeom prst="rect">
-                      <a:avLst/>
-                    </a:prstGeom>
-                  </pic:spPr>
-                </pic:pic>
-              </a:graphicData>
-            </a:graphic>
-          </wp:anchor>
-        </w:drawing>
-      </w:r>
+      <w:bookmarkStart w:id="0" w:name="_GoBack"/>
       <w:r>
         <mc:AlternateContent>
           <mc:Choice Requires="wps">
@@ -2709,9 +3053,9 @@
                   <wp:posOffset>2560320</wp:posOffset>
                 </wp:positionV>
                 <wp:extent cx="3285490" cy="2099945"/>
-                <wp:effectExtent l="6350" t="6350" r="10160" b="27305"/>
+                <wp:effectExtent l="6350" t="6350" r="15240" b="12065"/>
                 <wp:wrapNone/>
-                <wp:docPr id="1" name="Freeform 212"/>
+                <wp:docPr id="20" name="Freeform 212"/>
                 <wp:cNvGraphicFramePr/>
                 <a:graphic xmlns:a="http://schemas.openxmlformats.org/drawingml/2006/main">
                   <a:graphicData uri="http://schemas.microsoft.com/office/word/2010/wordprocessingShape">
@@ -2789,7 +3133,7 @@
           </mc:Choice>
           <mc:Fallback>
             <w:pict>
-              <v:shape id="Freeform 212" o:spid="_x0000_s1026" o:spt="100" style="position:absolute;left:0pt;margin-left:2.7pt;margin-top:201.6pt;height:165.35pt;width:258.7pt;mso-wrap-style:none;z-index:251659264;v-text-anchor:middle;mso-width-relative:page;mso-height-relative:page;" fillcolor="#FFFFFF [3201]" filled="t" stroked="t" coordsize="21600,21600" o:gfxdata="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" path="m0,0l21600,0,21600,21600,0,21600,0,0xe">
+              <v:shape id="Freeform 212" o:spid="_x0000_s1026" o:spt="100" style="position:absolute;left:0pt;margin-left:2.7pt;margin-top:201.6pt;height:165.35pt;width:258.7pt;mso-wrap-style:none;z-index:251659264;v-text-anchor:middle;mso-width-relative:page;mso-height-relative:page;" fillcolor="#FFFFFF [3201]" filled="t" stroked="t" coordsize="21600,21600" o:gfxdata="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" path="m0,0l21600,0,21600,21600,0,21600,0,0xe">
                 <v:path o:connectlocs="1642745,0;3285490,1049972;1642745,2099945;0,1049972" o:connectangles="0,0,82,164"/>
                 <v:fill on="t" focussize="0,0"/>
                 <v:stroke weight="1pt" color="#000000 [3200]" miterlimit="8" joinstyle="miter"/>
@@ -2801,7 +3145,10 @@
           </mc:Fallback>
         </mc:AlternateContent>
       </w:r>
+      <w:bookmarkEnd w:id="0"/>
     </w:p>
+    <w:p/>
+    <w:p/>
     <w:sectPr>
       <w:pgSz w:w="11906" w:h="16838"/>
       <w:pgMar w:top="720" w:right="720" w:bottom="720" w:left="720" w:header="720" w:footer="720" w:gutter="0"/>
@@ -2888,7 +3235,7 @@
     <w:lsdException w:qFormat="1" w:unhideWhenUsed="0" w:uiPriority="0" w:semiHidden="0" w:name="Title"/>
     <w:lsdException w:unhideWhenUsed="0" w:uiPriority="0" w:semiHidden="0" w:name="Closing"/>
     <w:lsdException w:unhideWhenUsed="0" w:uiPriority="0" w:semiHidden="0" w:name="Signature"/>
-    <w:lsdException w:unhideWhenUsed="0" w:uiPriority="0" w:name="Default Paragraph Font"/>
+    <w:lsdException w:qFormat="1" w:unhideWhenUsed="0" w:uiPriority="0" w:name="Default Paragraph Font"/>
     <w:lsdException w:unhideWhenUsed="0" w:uiPriority="0" w:semiHidden="0" w:name="Body Text"/>
     <w:lsdException w:unhideWhenUsed="0" w:uiPriority="0" w:semiHidden="0" w:name="Body Text Indent"/>
     <w:lsdException w:unhideWhenUsed="0" w:uiPriority="0" w:semiHidden="0" w:name="List Continue"/>
@@ -3084,6 +3431,7 @@
   <w:style w:type="character" w:default="1" w:styleId="2">
     <w:name w:val="Default Paragraph Font"/>
     <w:semiHidden/>
+    <w:qFormat/>
     <w:uiPriority w:val="0"/>
   </w:style>
   <w:style w:type="table" w:default="1" w:styleId="3">

</xml_diff>